<commit_message>
Agregado de documento de sistema actual
</commit_message>
<xml_diff>
--- a/docs/Documento de Casos de Uso.docx
+++ b/docs/Documento de Casos de Uso.docx
@@ -307,25 +307,7 @@
           <w:sz w:val="36"/>
           <w:szCs w:val="36"/>
         </w:rPr>
-        <w:t xml:space="preserve">03 de </w:t>
-      </w:r>
-      <w:proofErr w:type="gramStart"/>
-      <w:r>
-        <w:rPr>
-          <w:b/>
-          <w:sz w:val="36"/>
-          <w:szCs w:val="36"/>
-        </w:rPr>
-        <w:t>Junio</w:t>
-      </w:r>
-      <w:proofErr w:type="gramEnd"/>
-      <w:r>
-        <w:rPr>
-          <w:b/>
-          <w:sz w:val="36"/>
-          <w:szCs w:val="36"/>
-        </w:rPr>
-        <w:t xml:space="preserve"> del 2025</w:t>
+        <w:t>03 de Junio del 2025</w:t>
       </w:r>
     </w:p>
     <w:p>
@@ -1110,16 +1092,12 @@
           <w:p>
             <w:pPr>
               <w:rPr>
-                <w:rFonts w:ascii="Arial" w:eastAsia="Arial" w:hAnsi="Arial" w:cs="Arial"/>
-                <w:sz w:val="22"/>
-                <w:szCs w:val="22"/>
-              </w:rPr>
-            </w:pPr>
-            <w:r>
-              <w:rPr>
-                <w:rFonts w:ascii="Arial" w:eastAsia="Arial" w:hAnsi="Arial" w:cs="Arial"/>
-                <w:sz w:val="22"/>
-                <w:szCs w:val="22"/>
+                <w:rFonts w:eastAsia="Arial"/>
+              </w:rPr>
+            </w:pPr>
+            <w:r>
+              <w:rPr>
+                <w:rFonts w:eastAsia="Arial"/>
               </w:rPr>
               <w:t>Colaborador</w:t>
             </w:r>
@@ -1142,34 +1120,23 @@
             </w:tcMar>
           </w:tcPr>
           <w:p>
-            <w:r>
-              <w:rPr>
-                <w:rFonts w:hAnsi="Symbol"/>
-              </w:rPr>
-              <w:t></w:t>
-            </w:r>
-            <w:r>
-              <w:t xml:space="preserve">  </w:t>
-            </w:r>
-            <w:r>
+            <w:pPr>
               <w:rPr>
                 <w:rStyle w:val="citation-208"/>
               </w:rPr>
+            </w:pPr>
+          </w:p>
+          <w:p>
+            <w:r>
+              <w:rPr>
+                <w:rStyle w:val="citation-208"/>
+              </w:rPr>
               <w:t xml:space="preserve">CUGR-001 Registrar cliente con contrato de comidas </w:t>
             </w:r>
           </w:p>
           <w:p>
             <w:r>
               <w:rPr>
-                <w:rFonts w:hAnsi="Symbol"/>
-              </w:rPr>
-              <w:t></w:t>
-            </w:r>
-            <w:r>
-              <w:t xml:space="preserve">  </w:t>
-            </w:r>
-            <w:r>
-              <w:rPr>
                 <w:rStyle w:val="citation-207"/>
               </w:rPr>
               <w:t xml:space="preserve">CUGR-002 Registrar Reservación de Comidas </w:t>
@@ -1178,15 +1145,6 @@
           <w:p>
             <w:r>
               <w:rPr>
-                <w:rFonts w:hAnsi="Symbol"/>
-              </w:rPr>
-              <w:t></w:t>
-            </w:r>
-            <w:r>
-              <w:t xml:space="preserve">  </w:t>
-            </w:r>
-            <w:r>
-              <w:rPr>
                 <w:rStyle w:val="citation-206"/>
               </w:rPr>
               <w:t xml:space="preserve">CU-003 Consulta información del personal </w:t>
@@ -1200,15 +1158,6 @@
             </w:pPr>
             <w:r>
               <w:rPr>
-                <w:rFonts w:hAnsi="Symbol"/>
-              </w:rPr>
-              <w:t></w:t>
-            </w:r>
-            <w:r>
-              <w:t xml:space="preserve">  </w:t>
-            </w:r>
-            <w:r>
-              <w:rPr>
                 <w:rStyle w:val="citation-205"/>
               </w:rPr>
               <w:t>CU-005 Inicio sesión</w:t>
@@ -1217,15 +1166,6 @@
           <w:p>
             <w:r>
               <w:rPr>
-                <w:rFonts w:hAnsi="Symbol"/>
-              </w:rPr>
-              <w:t></w:t>
-            </w:r>
-            <w:r>
-              <w:t xml:space="preserve">  </w:t>
-            </w:r>
-            <w:r>
-              <w:rPr>
                 <w:rStyle w:val="citation-223"/>
               </w:rPr>
               <w:t xml:space="preserve">CUGV-001 Registro de ventas </w:t>
@@ -1234,32 +1174,15 @@
           <w:p>
             <w:r>
               <w:rPr>
-                <w:rFonts w:hAnsi="Symbol"/>
-              </w:rPr>
-              <w:t></w:t>
-            </w:r>
-            <w:r>
-              <w:t xml:space="preserve">  </w:t>
-            </w:r>
-            <w:r>
-              <w:rPr>
                 <w:rStyle w:val="citation-222"/>
               </w:rPr>
-              <w:t xml:space="preserve">CUGV-002 Generar factura o </w:t>
-            </w:r>
-            <w:proofErr w:type="gramStart"/>
+              <w:t xml:space="preserve">CUGV-002 Generar factura o ticket de caja </w:t>
+            </w:r>
             <w:r>
               <w:rPr>
                 <w:rStyle w:val="citation-222"/>
               </w:rPr>
-              <w:t>ticket</w:t>
-            </w:r>
-            <w:proofErr w:type="gramEnd"/>
-            <w:r>
-              <w:rPr>
-                <w:rStyle w:val="citation-222"/>
-              </w:rPr>
-              <w:t xml:space="preserve"> de caja </w:t>
+              <w:br/>
             </w:r>
           </w:p>
         </w:tc>
@@ -1284,16 +1207,12 @@
           <w:p>
             <w:pPr>
               <w:rPr>
-                <w:rFonts w:ascii="Arial" w:eastAsia="Arial" w:hAnsi="Arial" w:cs="Arial"/>
-                <w:sz w:val="22"/>
-                <w:szCs w:val="22"/>
-              </w:rPr>
-            </w:pPr>
-            <w:r>
-              <w:rPr>
-                <w:rFonts w:ascii="Arial" w:eastAsia="Arial" w:hAnsi="Arial" w:cs="Arial"/>
-                <w:sz w:val="22"/>
-                <w:szCs w:val="22"/>
+                <w:rFonts w:eastAsia="Arial"/>
+              </w:rPr>
+            </w:pPr>
+            <w:r>
+              <w:rPr>
+                <w:rFonts w:eastAsia="Arial"/>
               </w:rPr>
               <w:t>Administrador</w:t>
             </w:r>
@@ -1316,34 +1235,23 @@
             </w:tcMar>
           </w:tcPr>
           <w:p>
-            <w:r>
-              <w:rPr>
-                <w:rFonts w:hAnsi="Symbol"/>
-              </w:rPr>
-              <w:t></w:t>
-            </w:r>
-            <w:r>
-              <w:t xml:space="preserve">  </w:t>
-            </w:r>
-            <w:r>
+            <w:pPr>
               <w:rPr>
                 <w:rStyle w:val="citation-234"/>
               </w:rPr>
+            </w:pPr>
+          </w:p>
+          <w:p>
+            <w:r>
+              <w:rPr>
+                <w:rStyle w:val="citation-234"/>
+              </w:rPr>
               <w:t xml:space="preserve">CUGP-001 Registrar producto </w:t>
             </w:r>
           </w:p>
           <w:p>
             <w:r>
               <w:rPr>
-                <w:rFonts w:hAnsi="Symbol"/>
-              </w:rPr>
-              <w:t></w:t>
-            </w:r>
-            <w:r>
-              <w:t xml:space="preserve">  </w:t>
-            </w:r>
-            <w:r>
-              <w:rPr>
                 <w:rStyle w:val="citation-233"/>
               </w:rPr>
               <w:t xml:space="preserve">CUGP-002 Editar producto </w:t>
@@ -1352,30 +1260,17 @@
           <w:p>
             <w:r>
               <w:rPr>
-                <w:rFonts w:hAnsi="Symbol"/>
-              </w:rPr>
-              <w:t></w:t>
-            </w:r>
-            <w:r>
-              <w:t xml:space="preserve">  </w:t>
-            </w:r>
-            <w:r>
-              <w:rPr>
                 <w:rStyle w:val="citation-232"/>
               </w:rPr>
               <w:t xml:space="preserve">CUGP-003 Eliminar producto </w:t>
             </w:r>
           </w:p>
           <w:p>
-            <w:r>
-              <w:rPr>
-                <w:rFonts w:hAnsi="Symbol"/>
-              </w:rPr>
-              <w:t></w:t>
-            </w:r>
-            <w:r>
-              <w:t xml:space="preserve">  </w:t>
-            </w:r>
+            <w:pPr>
+              <w:rPr>
+                <w:del w:id="2" w:author="MELANIE OVIEDO MALEA�O" w:date="2025-07-31T14:36:00Z" w16du:dateUtc="2025-07-31T20:36:00Z"/>
+              </w:rPr>
+            </w:pPr>
             <w:r>
               <w:rPr>
                 <w:rStyle w:val="citation-231"/>
@@ -1384,105 +1279,85 @@
             </w:r>
           </w:p>
           <w:p>
-            <w:r>
-              <w:rPr>
-                <w:rFonts w:hAnsi="Symbol"/>
-              </w:rPr>
-              <w:t></w:t>
-            </w:r>
-            <w:r>
-              <w:t xml:space="preserve">  </w:t>
-            </w:r>
-            <w:r>
-              <w:rPr>
-                <w:rStyle w:val="citation-230"/>
-              </w:rPr>
-              <w:t xml:space="preserve">CUGP-006 </w:t>
-            </w:r>
-            <w:r>
-              <w:rPr>
-                <w:rStyle w:val="citation-230"/>
-                <w:highlight w:val="yellow"/>
-              </w:rPr>
-              <w:t>Calcular precio de venta con utilidad e impuestos</w:t>
-            </w:r>
-            <w:r>
-              <w:rPr>
-                <w:rStyle w:val="citation-230"/>
-              </w:rPr>
-              <w:t xml:space="preserve"> </w:t>
-            </w:r>
-          </w:p>
-          <w:p>
-            <w:r>
-              <w:rPr>
-                <w:rFonts w:hAnsi="Symbol"/>
-              </w:rPr>
-              <w:t></w:t>
-            </w:r>
-            <w:r>
-              <w:t xml:space="preserve">  </w:t>
-            </w:r>
-            <w:r>
-              <w:rPr>
-                <w:rStyle w:val="citation-229"/>
-              </w:rPr>
-              <w:t xml:space="preserve">CUGP-007 </w:t>
-            </w:r>
-            <w:r>
-              <w:rPr>
-                <w:rStyle w:val="citation-229"/>
-                <w:highlight w:val="yellow"/>
-              </w:rPr>
-              <w:t>Generar reporte de productos más vendidos</w:t>
-            </w:r>
-            <w:r>
-              <w:rPr>
-                <w:rStyle w:val="citation-229"/>
-              </w:rPr>
-              <w:t xml:space="preserve"> </w:t>
-            </w:r>
-          </w:p>
-          <w:p>
-            <w:r>
-              <w:rPr>
-                <w:rFonts w:hAnsi="Symbol"/>
-              </w:rPr>
-              <w:t></w:t>
-            </w:r>
-            <w:r>
-              <w:t xml:space="preserve">  </w:t>
-            </w:r>
-            <w:r>
-              <w:rPr>
-                <w:rStyle w:val="citation-228"/>
-              </w:rPr>
-              <w:t xml:space="preserve">CUGP-008 </w:t>
-            </w:r>
-            <w:r>
-              <w:rPr>
-                <w:rStyle w:val="citation-228"/>
-                <w:highlight w:val="yellow"/>
-              </w:rPr>
-              <w:t>Controlar platillos vendidos por periodo</w:t>
-            </w:r>
-            <w:r>
-              <w:rPr>
-                <w:rStyle w:val="citation-228"/>
-              </w:rPr>
-              <w:t xml:space="preserve"> </w:t>
-            </w:r>
-          </w:p>
-          <w:p>
-            <w:r>
-              <w:rPr>
-                <w:rFonts w:hAnsi="Symbol"/>
-              </w:rPr>
-              <w:t></w:t>
-            </w:r>
-            <w:r>
-              <w:t xml:space="preserve">  </w:t>
-            </w:r>
+            <w:pPr>
+              <w:rPr>
+                <w:del w:id="3" w:author="MELANIE OVIEDO MALEA�O" w:date="2025-07-31T14:36:00Z" w16du:dateUtc="2025-07-31T20:36:00Z"/>
+              </w:rPr>
+            </w:pPr>
+            <w:del w:id="4" w:author="MELANIE OVIEDO MALEA�O" w:date="2025-07-31T14:36:00Z" w16du:dateUtc="2025-07-31T20:36:00Z">
+              <w:r>
+                <w:rPr>
+                  <w:rStyle w:val="citation-230"/>
+                </w:rPr>
+                <w:delText xml:space="preserve">CUGP-006 </w:delText>
+              </w:r>
+              <w:r>
+                <w:rPr>
+                  <w:rStyle w:val="citation-230"/>
+                  <w:highlight w:val="yellow"/>
+                </w:rPr>
+                <w:delText>Calcular precio de venta con utilidad e impuestos</w:delText>
+              </w:r>
+              <w:r>
+                <w:rPr>
+                  <w:rStyle w:val="citation-230"/>
+                </w:rPr>
+                <w:delText xml:space="preserve"> </w:delText>
+              </w:r>
+            </w:del>
+          </w:p>
+          <w:p>
+            <w:pPr>
+              <w:rPr>
+                <w:del w:id="5" w:author="MELANIE OVIEDO MALEA�O" w:date="2025-07-31T14:36:00Z" w16du:dateUtc="2025-07-31T20:36:00Z"/>
+              </w:rPr>
+            </w:pPr>
+            <w:del w:id="6" w:author="MELANIE OVIEDO MALEA�O" w:date="2025-07-31T14:36:00Z" w16du:dateUtc="2025-07-31T20:36:00Z">
+              <w:r>
+                <w:rPr>
+                  <w:rStyle w:val="citation-229"/>
+                </w:rPr>
+                <w:delText xml:space="preserve">CUGP-007 </w:delText>
+              </w:r>
+              <w:r>
+                <w:rPr>
+                  <w:rStyle w:val="citation-229"/>
+                  <w:highlight w:val="yellow"/>
+                </w:rPr>
+                <w:delText>Generar reporte de productos más vendidos</w:delText>
+              </w:r>
+              <w:r>
+                <w:rPr>
+                  <w:rStyle w:val="citation-229"/>
+                </w:rPr>
+                <w:delText xml:space="preserve"> </w:delText>
+              </w:r>
+            </w:del>
+          </w:p>
+          <w:p>
+            <w:del w:id="7" w:author="MELANIE OVIEDO MALEA�O" w:date="2025-07-31T14:36:00Z" w16du:dateUtc="2025-07-31T20:36:00Z">
+              <w:r>
+                <w:rPr>
+                  <w:rStyle w:val="citation-228"/>
+                </w:rPr>
+                <w:delText xml:space="preserve">CUGP-008 </w:delText>
+              </w:r>
+              <w:r>
+                <w:rPr>
+                  <w:rStyle w:val="citation-228"/>
+                  <w:highlight w:val="yellow"/>
+                </w:rPr>
+                <w:delText>Controlar platillos vendidos por periodo</w:delText>
+              </w:r>
+              <w:r>
+                <w:rPr>
+                  <w:rStyle w:val="citation-228"/>
+                </w:rPr>
+                <w:delText xml:space="preserve"> </w:delText>
+              </w:r>
+            </w:del>
+          </w:p>
+          <w:p>
             <w:r>
               <w:rPr>
                 <w:rStyle w:val="citation-227"/>
@@ -1493,30 +1368,17 @@
           <w:p>
             <w:r>
               <w:rPr>
-                <w:rFonts w:hAnsi="Symbol"/>
-              </w:rPr>
-              <w:t></w:t>
-            </w:r>
-            <w:r>
-              <w:t xml:space="preserve">  </w:t>
-            </w:r>
-            <w:r>
-              <w:rPr>
                 <w:rStyle w:val="citation-226"/>
               </w:rPr>
               <w:t xml:space="preserve">CUGR-001 Registrar cliente con contrato de comidas </w:t>
             </w:r>
           </w:p>
           <w:p>
-            <w:r>
-              <w:rPr>
-                <w:rFonts w:hAnsi="Symbol"/>
-              </w:rPr>
-              <w:t></w:t>
-            </w:r>
-            <w:r>
-              <w:t xml:space="preserve">  </w:t>
-            </w:r>
+            <w:pPr>
+              <w:rPr>
+                <w:del w:id="8" w:author="MELANIE OVIEDO MALEA�O" w:date="2025-07-31T14:36:00Z" w16du:dateUtc="2025-07-31T20:36:00Z"/>
+              </w:rPr>
+            </w:pPr>
             <w:r>
               <w:rPr>
                 <w:rStyle w:val="citation-225"/>
@@ -1525,45 +1387,32 @@
             </w:r>
           </w:p>
           <w:p>
-            <w:r>
-              <w:rPr>
-                <w:rFonts w:hAnsi="Symbol"/>
-              </w:rPr>
-              <w:t></w:t>
-            </w:r>
-            <w:r>
-              <w:t xml:space="preserve">  </w:t>
-            </w:r>
-            <w:r>
-              <w:rPr>
-                <w:rStyle w:val="citation-224"/>
-              </w:rPr>
-              <w:t xml:space="preserve">CUGR-003 </w:t>
-            </w:r>
-            <w:r>
-              <w:rPr>
-                <w:rStyle w:val="citation-224"/>
-                <w:highlight w:val="yellow"/>
-              </w:rPr>
-              <w:t>Analizar Frecuencia del Menú</w:t>
-            </w:r>
-            <w:r>
-              <w:rPr>
-                <w:rStyle w:val="citation-224"/>
-              </w:rPr>
-              <w:t xml:space="preserve"> </w:t>
-            </w:r>
-          </w:p>
-          <w:p>
-            <w:r>
-              <w:rPr>
-                <w:rFonts w:hAnsi="Symbol"/>
-              </w:rPr>
-              <w:t></w:t>
-            </w:r>
-            <w:r>
-              <w:t xml:space="preserve">  </w:t>
-            </w:r>
+            <w:del w:id="9" w:author="MELANIE OVIEDO MALEA�O" w:date="2025-07-31T14:36:00Z" w16du:dateUtc="2025-07-31T20:36:00Z">
+              <w:r>
+                <w:rPr>
+                  <w:rStyle w:val="citation-224"/>
+                </w:rPr>
+                <w:delText xml:space="preserve">CUGR-003 </w:delText>
+              </w:r>
+              <w:commentRangeStart w:id="10"/>
+              <w:r>
+                <w:rPr>
+                  <w:rStyle w:val="citation-224"/>
+                </w:rPr>
+                <w:delText xml:space="preserve">Analizar Frecuencia del Menú </w:delText>
+              </w:r>
+              <w:commentRangeEnd w:id="10"/>
+              <w:r>
+                <w:rPr>
+                  <w:rStyle w:val="Refdecomentario"/>
+                  <w:sz w:val="24"/>
+                  <w:szCs w:val="24"/>
+                </w:rPr>
+                <w:commentReference w:id="10"/>
+              </w:r>
+            </w:del>
+          </w:p>
+          <w:p>
             <w:r>
               <w:rPr>
                 <w:rStyle w:val="citation-223"/>
@@ -1574,44 +1423,12 @@
           <w:p>
             <w:r>
               <w:rPr>
-                <w:rFonts w:hAnsi="Symbol"/>
-              </w:rPr>
-              <w:t></w:t>
-            </w:r>
-            <w:r>
-              <w:t xml:space="preserve">  </w:t>
-            </w:r>
-            <w:r>
-              <w:rPr>
                 <w:rStyle w:val="citation-222"/>
               </w:rPr>
-              <w:t xml:space="preserve">CUGV-002 Generar factura o </w:t>
-            </w:r>
-            <w:proofErr w:type="gramStart"/>
-            <w:r>
-              <w:rPr>
-                <w:rStyle w:val="citation-222"/>
-              </w:rPr>
-              <w:t>ticket</w:t>
-            </w:r>
-            <w:proofErr w:type="gramEnd"/>
-            <w:r>
-              <w:rPr>
-                <w:rStyle w:val="citation-222"/>
-              </w:rPr>
-              <w:t xml:space="preserve"> de caja </w:t>
-            </w:r>
-          </w:p>
-          <w:p>
-            <w:r>
-              <w:rPr>
-                <w:rFonts w:hAnsi="Symbol"/>
-              </w:rPr>
-              <w:t></w:t>
-            </w:r>
-            <w:r>
-              <w:t xml:space="preserve">  </w:t>
-            </w:r>
+              <w:t xml:space="preserve">CUGV-002 Generar factura o ticket de caja </w:t>
+            </w:r>
+          </w:p>
+          <w:p>
             <w:r>
               <w:rPr>
                 <w:rStyle w:val="citation-221"/>
@@ -1622,15 +1439,6 @@
           <w:p>
             <w:r>
               <w:rPr>
-                <w:rFonts w:hAnsi="Symbol"/>
-              </w:rPr>
-              <w:t></w:t>
-            </w:r>
-            <w:r>
-              <w:t xml:space="preserve">  </w:t>
-            </w:r>
-            <w:r>
-              <w:rPr>
                 <w:rStyle w:val="citation-220"/>
               </w:rPr>
               <w:t xml:space="preserve">CU-001 Registrar usuario </w:t>
@@ -1639,15 +1447,6 @@
           <w:p>
             <w:r>
               <w:rPr>
-                <w:rFonts w:hAnsi="Symbol"/>
-              </w:rPr>
-              <w:t></w:t>
-            </w:r>
-            <w:r>
-              <w:t xml:space="preserve">  </w:t>
-            </w:r>
-            <w:r>
-              <w:rPr>
                 <w:rStyle w:val="citation-219"/>
               </w:rPr>
               <w:t xml:space="preserve">CU-002 Modificar información del usuario </w:t>
@@ -1656,15 +1455,6 @@
           <w:p>
             <w:r>
               <w:rPr>
-                <w:rFonts w:hAnsi="Symbol"/>
-              </w:rPr>
-              <w:t></w:t>
-            </w:r>
-            <w:r>
-              <w:t xml:space="preserve">  </w:t>
-            </w:r>
-            <w:r>
-              <w:rPr>
                 <w:rStyle w:val="citation-218"/>
               </w:rPr>
               <w:t xml:space="preserve">CU-003 Consulta información del personal </w:t>
@@ -1673,15 +1463,6 @@
           <w:p>
             <w:r>
               <w:rPr>
-                <w:rFonts w:hAnsi="Symbol"/>
-              </w:rPr>
-              <w:t></w:t>
-            </w:r>
-            <w:r>
-              <w:t xml:space="preserve">  </w:t>
-            </w:r>
-            <w:r>
-              <w:rPr>
                 <w:rStyle w:val="citation-217"/>
               </w:rPr>
               <w:t xml:space="preserve">CU-004 Eliminar usuario </w:t>
@@ -1690,15 +1471,6 @@
           <w:p>
             <w:r>
               <w:rPr>
-                <w:rFonts w:hAnsi="Symbol"/>
-              </w:rPr>
-              <w:t></w:t>
-            </w:r>
-            <w:r>
-              <w:t xml:space="preserve">  </w:t>
-            </w:r>
-            <w:r>
-              <w:rPr>
                 <w:rStyle w:val="citation-216"/>
               </w:rPr>
               <w:t xml:space="preserve">CU-005 Inicio sesión </w:t>
@@ -1707,15 +1479,6 @@
           <w:p>
             <w:r>
               <w:rPr>
-                <w:rFonts w:hAnsi="Symbol"/>
-              </w:rPr>
-              <w:t></w:t>
-            </w:r>
-            <w:r>
-              <w:t xml:space="preserve">  </w:t>
-            </w:r>
-            <w:r>
-              <w:rPr>
                 <w:rStyle w:val="citation-215"/>
               </w:rPr>
               <w:t xml:space="preserve">CUGRP-001 Generar reporte de ventas </w:t>
@@ -1724,15 +1487,6 @@
           <w:p>
             <w:r>
               <w:rPr>
-                <w:rFonts w:hAnsi="Symbol"/>
-              </w:rPr>
-              <w:t></w:t>
-            </w:r>
-            <w:r>
-              <w:t xml:space="preserve">  </w:t>
-            </w:r>
-            <w:r>
-              <w:rPr>
                 <w:rStyle w:val="citation-214"/>
               </w:rPr>
               <w:t xml:space="preserve">CUGRP-002 Generar reporte de productos más vendidos </w:t>
@@ -1741,15 +1495,6 @@
           <w:p>
             <w:r>
               <w:rPr>
-                <w:rFonts w:hAnsi="Symbol"/>
-              </w:rPr>
-              <w:t></w:t>
-            </w:r>
-            <w:r>
-              <w:t xml:space="preserve">  </w:t>
-            </w:r>
-            <w:r>
-              <w:rPr>
                 <w:rStyle w:val="citation-213"/>
               </w:rPr>
               <w:t xml:space="preserve">CUGRP-003 Exportar reportes a Excel </w:t>
@@ -1758,15 +1503,6 @@
           <w:p>
             <w:r>
               <w:rPr>
-                <w:rFonts w:hAnsi="Symbol"/>
-              </w:rPr>
-              <w:t></w:t>
-            </w:r>
-            <w:r>
-              <w:t xml:space="preserve">  </w:t>
-            </w:r>
-            <w:r>
-              <w:rPr>
                 <w:rStyle w:val="citation-212"/>
               </w:rPr>
               <w:t xml:space="preserve">CUGRP-004 Generar reporte de reservaciones </w:t>
@@ -1775,15 +1511,6 @@
           <w:p>
             <w:r>
               <w:rPr>
-                <w:rFonts w:hAnsi="Symbol"/>
-              </w:rPr>
-              <w:t></w:t>
-            </w:r>
-            <w:r>
-              <w:t xml:space="preserve">  </w:t>
-            </w:r>
-            <w:r>
-              <w:rPr>
                 <w:rStyle w:val="citation-211"/>
               </w:rPr>
               <w:t xml:space="preserve">CUGPR-001 Registrar proveedor </w:t>
@@ -1792,15 +1519,6 @@
           <w:p>
             <w:r>
               <w:rPr>
-                <w:rFonts w:hAnsi="Symbol"/>
-              </w:rPr>
-              <w:t></w:t>
-            </w:r>
-            <w:r>
-              <w:t xml:space="preserve">  </w:t>
-            </w:r>
-            <w:r>
-              <w:rPr>
                 <w:rStyle w:val="citation-210"/>
               </w:rPr>
               <w:t xml:space="preserve">CUGPR-002 Consultar y filtrar proveedores </w:t>
@@ -1809,26 +1527,22 @@
           <w:p>
             <w:pPr>
               <w:rPr>
-                <w:rFonts w:ascii="Arial" w:eastAsia="Arial" w:hAnsi="Arial" w:cs="Arial"/>
-                <w:sz w:val="22"/>
-                <w:szCs w:val="22"/>
-              </w:rPr>
-            </w:pPr>
-            <w:r>
-              <w:rPr>
-                <w:rFonts w:hAnsi="Symbol"/>
-              </w:rPr>
-              <w:t></w:t>
-            </w:r>
-            <w:r>
-              <w:t xml:space="preserve">  </w:t>
-            </w:r>
-            <w:r>
-              <w:rPr>
                 <w:rStyle w:val="citation-209"/>
               </w:rPr>
+            </w:pPr>
+            <w:r>
+              <w:rPr>
+                <w:rStyle w:val="citation-209"/>
+              </w:rPr>
               <w:t>CUGPR-003 Editar información del proveedor</w:t>
             </w:r>
+          </w:p>
+          <w:p>
+            <w:pPr>
+              <w:rPr>
+                <w:rFonts w:eastAsia="Arial"/>
+              </w:rPr>
+            </w:pPr>
           </w:p>
         </w:tc>
       </w:tr>
@@ -1863,6 +1577,7 @@
       </w:r>
     </w:p>
     <w:p>
+      <w:commentRangeStart w:id="11"/>
       <w:r>
         <w:rPr>
           <w:noProof/>
@@ -1883,7 +1598,7 @@
                     <pic:cNvPicPr/>
                   </pic:nvPicPr>
                   <pic:blipFill>
-                    <a:blip r:embed="rId10"/>
+                    <a:blip r:embed="rId14"/>
                     <a:stretch>
                       <a:fillRect/>
                     </a:stretch>
@@ -1903,6 +1618,15 @@
           </wp:inline>
         </w:drawing>
       </w:r>
+      <w:commentRangeEnd w:id="11"/>
+      <w:r>
+        <w:rPr>
+          <w:rStyle w:val="Refdecomentario"/>
+          <w:sz w:val="24"/>
+          <w:szCs w:val="24"/>
+        </w:rPr>
+        <w:commentReference w:id="11"/>
+      </w:r>
     </w:p>
     <w:p>
       <w:r>
@@ -1931,8 +1655,8 @@
         </w:numPr>
         <w:jc w:val="both"/>
       </w:pPr>
-      <w:bookmarkStart w:id="2" w:name="_h9furi7fi2u5" w:colFirst="0" w:colLast="0"/>
-      <w:bookmarkEnd w:id="2"/>
+      <w:bookmarkStart w:id="12" w:name="_h9furi7fi2u5" w:colFirst="0" w:colLast="0"/>
+      <w:bookmarkEnd w:id="12"/>
       <w:r>
         <w:t>Módulo de Gestión de Productos</w:t>
       </w:r>
@@ -3096,8 +2820,8 @@
         <w:pStyle w:val="Ttulo2"/>
         <w:jc w:val="both"/>
       </w:pPr>
-      <w:bookmarkStart w:id="3" w:name="_tqqp93czvd98" w:colFirst="0" w:colLast="0"/>
-      <w:bookmarkEnd w:id="3"/>
+      <w:bookmarkStart w:id="13" w:name="_tqqp93czvd98" w:colFirst="0" w:colLast="0"/>
+      <w:bookmarkEnd w:id="13"/>
       <w:r>
         <w:br w:type="page"/>
       </w:r>
@@ -4344,8 +4068,8 @@
         <w:pStyle w:val="Ttulo2"/>
         <w:jc w:val="both"/>
       </w:pPr>
-      <w:bookmarkStart w:id="4" w:name="_hzon7hlsputw" w:colFirst="0" w:colLast="0"/>
-      <w:bookmarkEnd w:id="4"/>
+      <w:bookmarkStart w:id="14" w:name="_hzon7hlsputw" w:colFirst="0" w:colLast="0"/>
+      <w:bookmarkEnd w:id="14"/>
     </w:p>
     <w:tbl>
       <w:tblPr>
@@ -5108,25 +4832,7 @@
                 <w:sz w:val="22"/>
                 <w:szCs w:val="22"/>
               </w:rPr>
-              <w:t xml:space="preserve">El sistema elimina el producto del inventario </w:t>
-            </w:r>
-            <w:proofErr w:type="gramStart"/>
-            <w:r>
-              <w:rPr>
-                <w:rFonts w:ascii="Arial" w:eastAsia="Arial" w:hAnsi="Arial" w:cs="Arial"/>
-                <w:sz w:val="22"/>
-                <w:szCs w:val="22"/>
-              </w:rPr>
-              <w:t>activo</w:t>
-            </w:r>
-            <w:proofErr w:type="gramEnd"/>
-            <w:r>
-              <w:rPr>
-                <w:rFonts w:ascii="Arial" w:eastAsia="Arial" w:hAnsi="Arial" w:cs="Arial"/>
-                <w:sz w:val="22"/>
-                <w:szCs w:val="22"/>
-              </w:rPr>
-              <w:t xml:space="preserve"> pero conserva el historial de ventas.</w:t>
+              <w:t>El sistema elimina el producto del inventario activo pero conserva el historial de ventas.</w:t>
             </w:r>
           </w:p>
           <w:p>
@@ -5610,8 +5316,8 @@
         <w:pStyle w:val="Ttulo2"/>
         <w:jc w:val="both"/>
       </w:pPr>
-      <w:bookmarkStart w:id="5" w:name="_vuc5jeg2ae9n" w:colFirst="0" w:colLast="0"/>
-      <w:bookmarkEnd w:id="5"/>
+      <w:bookmarkStart w:id="15" w:name="_vuc5jeg2ae9n" w:colFirst="0" w:colLast="0"/>
+      <w:bookmarkEnd w:id="15"/>
     </w:p>
     <w:tbl>
       <w:tblPr>
@@ -6737,8 +6443,8 @@
         <w:pStyle w:val="Ttulo2"/>
         <w:jc w:val="both"/>
       </w:pPr>
-      <w:bookmarkStart w:id="6" w:name="_bmxbticsbzg1" w:colFirst="0" w:colLast="0"/>
-      <w:bookmarkEnd w:id="6"/>
+      <w:bookmarkStart w:id="16" w:name="_bmxbticsbzg1" w:colFirst="0" w:colLast="0"/>
+      <w:bookmarkEnd w:id="16"/>
     </w:p>
     <w:p/>
     <w:p/>
@@ -7823,8 +7529,8 @@
         <w:pStyle w:val="Ttulo2"/>
         <w:jc w:val="both"/>
       </w:pPr>
-      <w:bookmarkStart w:id="7" w:name="_tqlhqvyq93ya" w:colFirst="0" w:colLast="0"/>
-      <w:bookmarkEnd w:id="7"/>
+      <w:bookmarkStart w:id="17" w:name="_tqlhqvyq93ya" w:colFirst="0" w:colLast="0"/>
+      <w:bookmarkEnd w:id="17"/>
     </w:p>
     <w:p/>
     <w:p/>
@@ -8979,8 +8685,8 @@
         <w:pStyle w:val="Ttulo2"/>
         <w:jc w:val="both"/>
       </w:pPr>
-      <w:bookmarkStart w:id="8" w:name="_g15cbnt35vpr" w:colFirst="0" w:colLast="0"/>
-      <w:bookmarkEnd w:id="8"/>
+      <w:bookmarkStart w:id="18" w:name="_g15cbnt35vpr" w:colFirst="0" w:colLast="0"/>
+      <w:bookmarkEnd w:id="18"/>
     </w:p>
     <w:p/>
     <w:p/>
@@ -10070,8 +9776,8 @@
         <w:pStyle w:val="Ttulo2"/>
         <w:jc w:val="both"/>
       </w:pPr>
-      <w:bookmarkStart w:id="9" w:name="_lb66sqjcv2ws" w:colFirst="0" w:colLast="0"/>
-      <w:bookmarkEnd w:id="9"/>
+      <w:bookmarkStart w:id="19" w:name="_lb66sqjcv2ws" w:colFirst="0" w:colLast="0"/>
+      <w:bookmarkEnd w:id="19"/>
     </w:p>
     <w:p/>
     <w:p/>
@@ -11278,23 +10984,10 @@
         </w:numPr>
         <w:jc w:val="both"/>
       </w:pPr>
-      <w:bookmarkStart w:id="10" w:name="_8bv2b092384s" w:colFirst="0" w:colLast="0"/>
-      <w:bookmarkEnd w:id="10"/>
-      <w:proofErr w:type="spellStart"/>
+      <w:bookmarkStart w:id="20" w:name="_8bv2b092384s" w:colFirst="0" w:colLast="0"/>
+      <w:bookmarkEnd w:id="20"/>
       <w:r>
-        <w:t>Modulo</w:t>
-      </w:r>
-      <w:proofErr w:type="spellEnd"/>
-      <w:r>
-        <w:t xml:space="preserve"> de </w:t>
-      </w:r>
-      <w:proofErr w:type="spellStart"/>
-      <w:r>
-        <w:t>Gestion</w:t>
-      </w:r>
-      <w:proofErr w:type="spellEnd"/>
-      <w:r>
-        <w:t xml:space="preserve"> de Inventario de Insumos</w:t>
+        <w:t>Modulo de Gestion de Inventario de Insumos</w:t>
       </w:r>
     </w:p>
     <w:tbl>
@@ -11994,67 +11687,7 @@
                 <w:sz w:val="22"/>
                 <w:szCs w:val="22"/>
               </w:rPr>
-              <w:t>El Administrador ingresa los datos del insumo (</w:t>
-            </w:r>
-            <w:proofErr w:type="spellStart"/>
-            <w:proofErr w:type="gramStart"/>
-            <w:r>
-              <w:rPr>
-                <w:rFonts w:ascii="Arial" w:eastAsia="Arial" w:hAnsi="Arial" w:cs="Arial"/>
-                <w:sz w:val="22"/>
-                <w:szCs w:val="22"/>
-              </w:rPr>
-              <w:t>Nombre,Unidad</w:t>
-            </w:r>
-            <w:proofErr w:type="spellEnd"/>
-            <w:proofErr w:type="gramEnd"/>
-            <w:r>
-              <w:rPr>
-                <w:rFonts w:ascii="Arial" w:eastAsia="Arial" w:hAnsi="Arial" w:cs="Arial"/>
-                <w:sz w:val="22"/>
-                <w:szCs w:val="22"/>
-              </w:rPr>
-              <w:t xml:space="preserve"> de medida, cantidad </w:t>
-            </w:r>
-            <w:proofErr w:type="spellStart"/>
-            <w:proofErr w:type="gramStart"/>
-            <w:r>
-              <w:rPr>
-                <w:rFonts w:ascii="Arial" w:eastAsia="Arial" w:hAnsi="Arial" w:cs="Arial"/>
-                <w:sz w:val="22"/>
-                <w:szCs w:val="22"/>
-              </w:rPr>
-              <w:t>inicial,punto</w:t>
-            </w:r>
-            <w:proofErr w:type="spellEnd"/>
-            <w:proofErr w:type="gramEnd"/>
-            <w:r>
-              <w:rPr>
-                <w:rFonts w:ascii="Arial" w:eastAsia="Arial" w:hAnsi="Arial" w:cs="Arial"/>
-                <w:sz w:val="22"/>
-                <w:szCs w:val="22"/>
-              </w:rPr>
-              <w:t xml:space="preserve"> de </w:t>
-            </w:r>
-            <w:proofErr w:type="spellStart"/>
-            <w:proofErr w:type="gramStart"/>
-            <w:r>
-              <w:rPr>
-                <w:rFonts w:ascii="Arial" w:eastAsia="Arial" w:hAnsi="Arial" w:cs="Arial"/>
-                <w:sz w:val="22"/>
-                <w:szCs w:val="22"/>
-              </w:rPr>
-              <w:t>reorden,proveedor</w:t>
-            </w:r>
-            <w:proofErr w:type="spellEnd"/>
-            <w:proofErr w:type="gramEnd"/>
-            <w:r>
-              <w:rPr>
-                <w:rFonts w:ascii="Arial" w:eastAsia="Arial" w:hAnsi="Arial" w:cs="Arial"/>
-                <w:sz w:val="22"/>
-                <w:szCs w:val="22"/>
-              </w:rPr>
-              <w:t>)</w:t>
+              <w:t>El Administrador ingresa los datos del insumo (Nombre,Unidad de medida, cantidad inicial,punto de reorden,proveedor)</w:t>
             </w:r>
           </w:p>
           <w:p>
@@ -12541,8 +12174,8 @@
         <w:pStyle w:val="Ttulo2"/>
         <w:jc w:val="both"/>
       </w:pPr>
-      <w:bookmarkStart w:id="11" w:name="_qa3umssve0wh" w:colFirst="0" w:colLast="0"/>
-      <w:bookmarkEnd w:id="11"/>
+      <w:bookmarkStart w:id="21" w:name="_qa3umssve0wh" w:colFirst="0" w:colLast="0"/>
+      <w:bookmarkEnd w:id="21"/>
     </w:p>
     <w:p/>
     <w:p/>
@@ -12779,25 +12412,7 @@
                 <w:sz w:val="22"/>
                 <w:szCs w:val="22"/>
               </w:rPr>
-              <w:t>Sistema (</w:t>
-            </w:r>
-            <w:proofErr w:type="spellStart"/>
-            <w:r>
-              <w:rPr>
-                <w:rFonts w:ascii="Arial" w:eastAsia="Arial" w:hAnsi="Arial" w:cs="Arial"/>
-                <w:sz w:val="22"/>
-                <w:szCs w:val="22"/>
-              </w:rPr>
-              <w:t>Automatico</w:t>
-            </w:r>
-            <w:proofErr w:type="spellEnd"/>
-            <w:r>
-              <w:rPr>
-                <w:rFonts w:ascii="Arial" w:eastAsia="Arial" w:hAnsi="Arial" w:cs="Arial"/>
-                <w:sz w:val="22"/>
-                <w:szCs w:val="22"/>
-              </w:rPr>
-              <w:t>)</w:t>
+              <w:t>Sistema (Automatico)</w:t>
             </w:r>
           </w:p>
         </w:tc>
@@ -13777,8 +13392,8 @@
         <w:pStyle w:val="Ttulo2"/>
         <w:jc w:val="both"/>
       </w:pPr>
-      <w:bookmarkStart w:id="12" w:name="_i3m4l771w6z8" w:colFirst="0" w:colLast="0"/>
-      <w:bookmarkEnd w:id="12"/>
+      <w:bookmarkStart w:id="22" w:name="_i3m4l771w6z8" w:colFirst="0" w:colLast="0"/>
+      <w:bookmarkEnd w:id="22"/>
     </w:p>
     <w:p/>
     <w:p/>
@@ -13793,8 +13408,8 @@
         </w:numPr>
         <w:jc w:val="both"/>
       </w:pPr>
-      <w:bookmarkStart w:id="13" w:name="_402nh37bp7v" w:colFirst="0" w:colLast="0"/>
-      <w:bookmarkEnd w:id="13"/>
+      <w:bookmarkStart w:id="23" w:name="_402nh37bp7v" w:colFirst="0" w:colLast="0"/>
+      <w:bookmarkEnd w:id="23"/>
       <w:r>
         <w:t>Módulo de Gestión de Reservas</w:t>
       </w:r>
@@ -14912,25 +14527,7 @@
                 <w:sz w:val="22"/>
                 <w:szCs w:val="22"/>
               </w:rPr>
-              <w:t>RN-</w:t>
-            </w:r>
-            <w:proofErr w:type="gramStart"/>
-            <w:r>
-              <w:rPr>
-                <w:rFonts w:ascii="Arial" w:eastAsia="Arial" w:hAnsi="Arial" w:cs="Arial"/>
-                <w:sz w:val="22"/>
-                <w:szCs w:val="22"/>
-              </w:rPr>
-              <w:t>005,RN</w:t>
-            </w:r>
-            <w:proofErr w:type="gramEnd"/>
-            <w:r>
-              <w:rPr>
-                <w:rFonts w:ascii="Arial" w:eastAsia="Arial" w:hAnsi="Arial" w:cs="Arial"/>
-                <w:sz w:val="22"/>
-                <w:szCs w:val="22"/>
-              </w:rPr>
-              <w:t>-006</w:t>
+              <w:t>RN-005,RN-006</w:t>
             </w:r>
           </w:p>
         </w:tc>
@@ -15024,8 +14621,8 @@
         <w:pStyle w:val="Ttulo2"/>
         <w:jc w:val="both"/>
       </w:pPr>
-      <w:bookmarkStart w:id="14" w:name="_q9pp61jnygr" w:colFirst="0" w:colLast="0"/>
-      <w:bookmarkEnd w:id="14"/>
+      <w:bookmarkStart w:id="24" w:name="_q9pp61jnygr" w:colFirst="0" w:colLast="0"/>
+      <w:bookmarkEnd w:id="24"/>
     </w:p>
     <w:tbl>
       <w:tblPr>
@@ -15326,25 +14923,7 @@
                 <w:sz w:val="22"/>
                 <w:szCs w:val="22"/>
               </w:rPr>
-              <w:t xml:space="preserve">Permite registrar reservaciones de comidas para clientes que requieren alimentos en uno o </w:t>
-            </w:r>
-            <w:proofErr w:type="gramStart"/>
-            <w:r>
-              <w:rPr>
-                <w:rFonts w:ascii="Arial" w:eastAsia="Arial" w:hAnsi="Arial" w:cs="Arial"/>
-                <w:sz w:val="22"/>
-                <w:szCs w:val="22"/>
-              </w:rPr>
-              <w:t>más tiempo específicos</w:t>
-            </w:r>
-            <w:proofErr w:type="gramEnd"/>
-            <w:r>
-              <w:rPr>
-                <w:rFonts w:ascii="Arial" w:eastAsia="Arial" w:hAnsi="Arial" w:cs="Arial"/>
-                <w:sz w:val="22"/>
-                <w:szCs w:val="22"/>
-              </w:rPr>
-              <w:t xml:space="preserve">, facilitando la planificación y preparación de los alimentos según la demanda reservada. </w:t>
+              <w:t xml:space="preserve">Permite registrar reservaciones de comidas para clientes que requieren alimentos en uno o más tiempo específicos, facilitando la planificación y preparación de los alimentos según la demanda reservada. </w:t>
             </w:r>
           </w:p>
         </w:tc>
@@ -17414,8 +16993,8 @@
         </w:numPr>
         <w:jc w:val="both"/>
       </w:pPr>
-      <w:bookmarkStart w:id="15" w:name="_j7l2a2crc31i" w:colFirst="0" w:colLast="0"/>
-      <w:bookmarkEnd w:id="15"/>
+      <w:bookmarkStart w:id="25" w:name="_j7l2a2crc31i" w:colFirst="0" w:colLast="0"/>
+      <w:bookmarkEnd w:id="25"/>
       <w:r>
         <w:t>Módulo de Gestión de Ventas</w:t>
       </w:r>
@@ -18764,25 +18343,7 @@
                 <w:sz w:val="22"/>
                 <w:szCs w:val="22"/>
               </w:rPr>
-              <w:t xml:space="preserve">Generar factura o </w:t>
-            </w:r>
-            <w:proofErr w:type="gramStart"/>
-            <w:r>
-              <w:rPr>
-                <w:rFonts w:ascii="Arial" w:eastAsia="Arial" w:hAnsi="Arial" w:cs="Arial"/>
-                <w:sz w:val="22"/>
-                <w:szCs w:val="22"/>
-              </w:rPr>
-              <w:t>ticket</w:t>
-            </w:r>
-            <w:proofErr w:type="gramEnd"/>
-            <w:r>
-              <w:rPr>
-                <w:rFonts w:ascii="Arial" w:eastAsia="Arial" w:hAnsi="Arial" w:cs="Arial"/>
-                <w:sz w:val="22"/>
-                <w:szCs w:val="22"/>
-              </w:rPr>
-              <w:t xml:space="preserve"> de caja</w:t>
+              <w:t>Generar factura o ticket de caja</w:t>
             </w:r>
           </w:p>
         </w:tc>
@@ -18928,25 +18489,7 @@
                 <w:sz w:val="22"/>
                 <w:szCs w:val="22"/>
               </w:rPr>
-              <w:t xml:space="preserve">Este caso de uso permite generar facturas o </w:t>
-            </w:r>
-            <w:proofErr w:type="gramStart"/>
-            <w:r>
-              <w:rPr>
-                <w:rFonts w:ascii="Arial" w:eastAsia="Arial" w:hAnsi="Arial" w:cs="Arial"/>
-                <w:sz w:val="22"/>
-                <w:szCs w:val="22"/>
-              </w:rPr>
-              <w:t>tickets</w:t>
-            </w:r>
-            <w:proofErr w:type="gramEnd"/>
-            <w:r>
-              <w:rPr>
-                <w:rFonts w:ascii="Arial" w:eastAsia="Arial" w:hAnsi="Arial" w:cs="Arial"/>
-                <w:sz w:val="22"/>
-                <w:szCs w:val="22"/>
-              </w:rPr>
-              <w:t xml:space="preserve"> de caja a solicitud del cliente. La funcionalidad contempla opciones como pagos divididos por cliente o por mesa, y una vez emitida la factura, no puede modificarse.</w:t>
+              <w:t>Este caso de uso permite generar facturas o tickets de caja a solicitud del cliente. La funcionalidad contempla opciones como pagos divididos por cliente o por mesa, y una vez emitida la factura, no puede modificarse.</w:t>
             </w:r>
           </w:p>
         </w:tc>
@@ -19042,25 +18585,7 @@
                 <w:sz w:val="22"/>
                 <w:szCs w:val="22"/>
               </w:rPr>
-              <w:t xml:space="preserve">El usuario debe tener permisos para emitir </w:t>
-            </w:r>
-            <w:proofErr w:type="gramStart"/>
-            <w:r>
-              <w:rPr>
-                <w:rFonts w:ascii="Arial" w:eastAsia="Arial" w:hAnsi="Arial" w:cs="Arial"/>
-                <w:sz w:val="22"/>
-                <w:szCs w:val="22"/>
-              </w:rPr>
-              <w:t>tickets</w:t>
-            </w:r>
-            <w:proofErr w:type="gramEnd"/>
-            <w:r>
-              <w:rPr>
-                <w:rFonts w:ascii="Arial" w:eastAsia="Arial" w:hAnsi="Arial" w:cs="Arial"/>
-                <w:sz w:val="22"/>
-                <w:szCs w:val="22"/>
-              </w:rPr>
-              <w:t>.</w:t>
+              <w:t>El usuario debe tener permisos para emitir tickets.</w:t>
             </w:r>
           </w:p>
         </w:tc>
@@ -19276,25 +18801,7 @@
                 <w:sz w:val="22"/>
                 <w:szCs w:val="22"/>
               </w:rPr>
-              <w:t xml:space="preserve">Decide si generar un </w:t>
-            </w:r>
-            <w:proofErr w:type="gramStart"/>
-            <w:r>
-              <w:rPr>
-                <w:rFonts w:ascii="Arial" w:eastAsia="Arial" w:hAnsi="Arial" w:cs="Arial"/>
-                <w:sz w:val="22"/>
-                <w:szCs w:val="22"/>
-              </w:rPr>
-              <w:t>ticket</w:t>
-            </w:r>
-            <w:proofErr w:type="gramEnd"/>
-            <w:r>
-              <w:rPr>
-                <w:rFonts w:ascii="Arial" w:eastAsia="Arial" w:hAnsi="Arial" w:cs="Arial"/>
-                <w:sz w:val="22"/>
-                <w:szCs w:val="22"/>
-              </w:rPr>
-              <w:t xml:space="preserve"> estándar o dividido.</w:t>
+              <w:t>Decide si generar un ticket estándar o dividido.</w:t>
             </w:r>
           </w:p>
           <w:p>
@@ -19337,25 +18844,7 @@
                 <w:sz w:val="22"/>
                 <w:szCs w:val="22"/>
               </w:rPr>
-              <w:t xml:space="preserve">El usuario confirma la emisión del </w:t>
-            </w:r>
-            <w:proofErr w:type="gramStart"/>
-            <w:r>
-              <w:rPr>
-                <w:rFonts w:ascii="Arial" w:eastAsia="Arial" w:hAnsi="Arial" w:cs="Arial"/>
-                <w:sz w:val="22"/>
-                <w:szCs w:val="22"/>
-              </w:rPr>
-              <w:t>ticket</w:t>
-            </w:r>
-            <w:proofErr w:type="gramEnd"/>
-            <w:r>
-              <w:rPr>
-                <w:rFonts w:ascii="Arial" w:eastAsia="Arial" w:hAnsi="Arial" w:cs="Arial"/>
-                <w:sz w:val="22"/>
-                <w:szCs w:val="22"/>
-              </w:rPr>
-              <w:t>.</w:t>
+              <w:t>El usuario confirma la emisión del ticket.</w:t>
             </w:r>
           </w:p>
           <w:p>
@@ -19376,25 +18865,7 @@
                 <w:sz w:val="22"/>
                 <w:szCs w:val="22"/>
               </w:rPr>
-              <w:t xml:space="preserve">El sistema genera y guarda el </w:t>
-            </w:r>
-            <w:proofErr w:type="gramStart"/>
-            <w:r>
-              <w:rPr>
-                <w:rFonts w:ascii="Arial" w:eastAsia="Arial" w:hAnsi="Arial" w:cs="Arial"/>
-                <w:sz w:val="22"/>
-                <w:szCs w:val="22"/>
-              </w:rPr>
-              <w:t>ticket</w:t>
-            </w:r>
-            <w:proofErr w:type="gramEnd"/>
-            <w:r>
-              <w:rPr>
-                <w:rFonts w:ascii="Arial" w:eastAsia="Arial" w:hAnsi="Arial" w:cs="Arial"/>
-                <w:sz w:val="22"/>
-                <w:szCs w:val="22"/>
-              </w:rPr>
-              <w:t xml:space="preserve"> de forma inmodificable.</w:t>
+              <w:t>El sistema genera y guarda el ticket de forma inmodificable.</w:t>
             </w:r>
           </w:p>
         </w:tc>
@@ -19491,25 +18962,7 @@
                 <w:sz w:val="22"/>
                 <w:szCs w:val="22"/>
               </w:rPr>
-              <w:t xml:space="preserve">Si el cliente decide no emitir el </w:t>
-            </w:r>
-            <w:proofErr w:type="gramStart"/>
-            <w:r>
-              <w:rPr>
-                <w:rFonts w:ascii="Arial" w:eastAsia="Arial" w:hAnsi="Arial" w:cs="Arial"/>
-                <w:sz w:val="22"/>
-                <w:szCs w:val="22"/>
-              </w:rPr>
-              <w:t>ticket</w:t>
-            </w:r>
-            <w:proofErr w:type="gramEnd"/>
-            <w:r>
-              <w:rPr>
-                <w:rFonts w:ascii="Arial" w:eastAsia="Arial" w:hAnsi="Arial" w:cs="Arial"/>
-                <w:sz w:val="22"/>
-                <w:szCs w:val="22"/>
-              </w:rPr>
-              <w:t>, el sistema finaliza el proceso sin generar la factura.</w:t>
+              <w:t>Si el cliente decide no emitir el ticket, el sistema finaliza el proceso sin generar la factura.</w:t>
             </w:r>
           </w:p>
           <w:p>
@@ -19530,25 +18983,7 @@
                 <w:sz w:val="22"/>
                 <w:szCs w:val="22"/>
               </w:rPr>
-              <w:t xml:space="preserve">Si el usuario desea posponer la generación del </w:t>
-            </w:r>
-            <w:proofErr w:type="gramStart"/>
-            <w:r>
-              <w:rPr>
-                <w:rFonts w:ascii="Arial" w:eastAsia="Arial" w:hAnsi="Arial" w:cs="Arial"/>
-                <w:sz w:val="22"/>
-                <w:szCs w:val="22"/>
-              </w:rPr>
-              <w:t>ticket</w:t>
-            </w:r>
-            <w:proofErr w:type="gramEnd"/>
-            <w:r>
-              <w:rPr>
-                <w:rFonts w:ascii="Arial" w:eastAsia="Arial" w:hAnsi="Arial" w:cs="Arial"/>
-                <w:sz w:val="22"/>
-                <w:szCs w:val="22"/>
-              </w:rPr>
-              <w:t>, el sistema guarda la venta sin emitir el comprobante en ese momento.</w:t>
+              <w:t>Si el usuario desea posponer la generación del ticket, el sistema guarda la venta sin emitir el comprobante en ese momento.</w:t>
             </w:r>
           </w:p>
         </w:tc>
@@ -19624,25 +19059,7 @@
                 <w:sz w:val="22"/>
                 <w:szCs w:val="22"/>
               </w:rPr>
-              <w:t xml:space="preserve">Si la venta seleccionada no existe o fue eliminada, el sistema notifica que no se puede generar el </w:t>
-            </w:r>
-            <w:proofErr w:type="gramStart"/>
-            <w:r>
-              <w:rPr>
-                <w:rFonts w:ascii="Arial" w:eastAsia="Arial" w:hAnsi="Arial" w:cs="Arial"/>
-                <w:sz w:val="22"/>
-                <w:szCs w:val="22"/>
-              </w:rPr>
-              <w:t>ticket</w:t>
-            </w:r>
-            <w:proofErr w:type="gramEnd"/>
-            <w:r>
-              <w:rPr>
-                <w:rFonts w:ascii="Arial" w:eastAsia="Arial" w:hAnsi="Arial" w:cs="Arial"/>
-                <w:sz w:val="22"/>
-                <w:szCs w:val="22"/>
-              </w:rPr>
-              <w:t>.</w:t>
+              <w:t>Si la venta seleccionada no existe o fue eliminada, el sistema notifica que no se puede generar el ticket.</w:t>
             </w:r>
           </w:p>
           <w:p>
@@ -19683,25 +19100,7 @@
                 <w:sz w:val="22"/>
                 <w:szCs w:val="22"/>
               </w:rPr>
-              <w:t xml:space="preserve">Si el sistema presenta fallas técnicas durante la emisión del </w:t>
-            </w:r>
-            <w:proofErr w:type="gramStart"/>
-            <w:r>
-              <w:rPr>
-                <w:rFonts w:ascii="Arial" w:eastAsia="Arial" w:hAnsi="Arial" w:cs="Arial"/>
-                <w:sz w:val="22"/>
-                <w:szCs w:val="22"/>
-              </w:rPr>
-              <w:t>ticket</w:t>
-            </w:r>
-            <w:proofErr w:type="gramEnd"/>
-            <w:r>
-              <w:rPr>
-                <w:rFonts w:ascii="Arial" w:eastAsia="Arial" w:hAnsi="Arial" w:cs="Arial"/>
-                <w:sz w:val="22"/>
-                <w:szCs w:val="22"/>
-              </w:rPr>
-              <w:t>, muestra un error y permite reintentar.</w:t>
+              <w:t>Si el sistema presenta fallas técnicas durante la emisión del ticket, muestra un error y permite reintentar.</w:t>
             </w:r>
           </w:p>
         </w:tc>
@@ -21063,8 +20462,8 @@
         </w:numPr>
         <w:jc w:val="both"/>
       </w:pPr>
-      <w:bookmarkStart w:id="16" w:name="_4q66ukcnlg46" w:colFirst="0" w:colLast="0"/>
-      <w:bookmarkEnd w:id="16"/>
+      <w:bookmarkStart w:id="26" w:name="_4q66ukcnlg46" w:colFirst="0" w:colLast="0"/>
+      <w:bookmarkEnd w:id="26"/>
       <w:r>
         <w:lastRenderedPageBreak/>
         <w:t>Módulo del Usuario</w:t>
@@ -22289,8 +21688,8 @@
                 <w:szCs w:val="22"/>
               </w:rPr>
             </w:pPr>
-            <w:bookmarkStart w:id="17" w:name="_m6yffzxo8cj2" w:colFirst="0" w:colLast="0"/>
-            <w:bookmarkEnd w:id="17"/>
+            <w:bookmarkStart w:id="27" w:name="_m6yffzxo8cj2" w:colFirst="0" w:colLast="0"/>
+            <w:bookmarkEnd w:id="27"/>
             <w:r>
               <w:rPr>
                 <w:rFonts w:ascii="Arial" w:eastAsia="Arial" w:hAnsi="Arial" w:cs="Arial"/>
@@ -23493,10 +22892,10 @@
           <w:rFonts w:eastAsia="Arial"/>
         </w:rPr>
       </w:pPr>
-      <w:bookmarkStart w:id="18" w:name="_q87mfjdnsqem" w:colFirst="0" w:colLast="0"/>
-      <w:bookmarkStart w:id="19" w:name="_zc9ftpib9xdj" w:colFirst="0" w:colLast="0"/>
-      <w:bookmarkEnd w:id="18"/>
-      <w:bookmarkEnd w:id="19"/>
+      <w:bookmarkStart w:id="28" w:name="_q87mfjdnsqem" w:colFirst="0" w:colLast="0"/>
+      <w:bookmarkStart w:id="29" w:name="_zc9ftpib9xdj" w:colFirst="0" w:colLast="0"/>
+      <w:bookmarkEnd w:id="28"/>
+      <w:bookmarkEnd w:id="29"/>
     </w:p>
     <w:tbl>
       <w:tblPr>
@@ -23842,8 +23241,8 @@
                 <w:szCs w:val="22"/>
               </w:rPr>
             </w:pPr>
-            <w:bookmarkStart w:id="20" w:name="_kjfiepd5g0eq" w:colFirst="0" w:colLast="0"/>
-            <w:bookmarkEnd w:id="20"/>
+            <w:bookmarkStart w:id="30" w:name="_kjfiepd5g0eq" w:colFirst="0" w:colLast="0"/>
+            <w:bookmarkEnd w:id="30"/>
             <w:r>
               <w:rPr>
                 <w:rFonts w:ascii="Arial" w:eastAsia="Arial" w:hAnsi="Arial" w:cs="Arial"/>
@@ -23929,8 +23328,8 @@
                 <w:szCs w:val="22"/>
               </w:rPr>
             </w:pPr>
-            <w:bookmarkStart w:id="21" w:name="_io47xhz7d639" w:colFirst="0" w:colLast="0"/>
-            <w:bookmarkEnd w:id="21"/>
+            <w:bookmarkStart w:id="31" w:name="_io47xhz7d639" w:colFirst="0" w:colLast="0"/>
+            <w:bookmarkEnd w:id="31"/>
             <w:r>
               <w:rPr>
                 <w:rFonts w:ascii="Arial" w:eastAsia="Arial" w:hAnsi="Arial" w:cs="Arial"/>
@@ -24016,8 +23415,8 @@
                 <w:szCs w:val="22"/>
               </w:rPr>
             </w:pPr>
-            <w:bookmarkStart w:id="22" w:name="_vu28aopbw788" w:colFirst="0" w:colLast="0"/>
-            <w:bookmarkEnd w:id="22"/>
+            <w:bookmarkStart w:id="32" w:name="_vu28aopbw788" w:colFirst="0" w:colLast="0"/>
+            <w:bookmarkEnd w:id="32"/>
             <w:r>
               <w:rPr>
                 <w:rFonts w:ascii="Arial" w:eastAsia="Arial" w:hAnsi="Arial" w:cs="Arial"/>
@@ -24154,8 +23553,8 @@
                 <w:szCs w:val="22"/>
               </w:rPr>
             </w:pPr>
-            <w:bookmarkStart w:id="23" w:name="_41k6vitq6js6" w:colFirst="0" w:colLast="0"/>
-            <w:bookmarkEnd w:id="23"/>
+            <w:bookmarkStart w:id="33" w:name="_41k6vitq6js6" w:colFirst="0" w:colLast="0"/>
+            <w:bookmarkEnd w:id="33"/>
             <w:r>
               <w:rPr>
                 <w:rFonts w:ascii="Arial" w:eastAsia="Arial" w:hAnsi="Arial" w:cs="Arial"/>
@@ -24241,8 +23640,8 @@
                 <w:szCs w:val="22"/>
               </w:rPr>
             </w:pPr>
-            <w:bookmarkStart w:id="24" w:name="_kykthxdfab9e" w:colFirst="0" w:colLast="0"/>
-            <w:bookmarkEnd w:id="24"/>
+            <w:bookmarkStart w:id="34" w:name="_kykthxdfab9e" w:colFirst="0" w:colLast="0"/>
+            <w:bookmarkEnd w:id="34"/>
             <w:r>
               <w:rPr>
                 <w:rFonts w:ascii="Arial" w:eastAsia="Arial" w:hAnsi="Arial" w:cs="Arial"/>
@@ -24329,8 +23728,8 @@
                 <w:szCs w:val="22"/>
               </w:rPr>
             </w:pPr>
-            <w:bookmarkStart w:id="25" w:name="_lsu8n24209ep" w:colFirst="0" w:colLast="0"/>
-            <w:bookmarkEnd w:id="25"/>
+            <w:bookmarkStart w:id="35" w:name="_lsu8n24209ep" w:colFirst="0" w:colLast="0"/>
+            <w:bookmarkEnd w:id="35"/>
             <w:r>
               <w:rPr>
                 <w:rFonts w:ascii="Arial" w:eastAsia="Arial" w:hAnsi="Arial" w:cs="Arial"/>
@@ -24544,8 +23943,8 @@
                 <w:szCs w:val="22"/>
               </w:rPr>
             </w:pPr>
-            <w:bookmarkStart w:id="26" w:name="_a710llt7r7bq" w:colFirst="0" w:colLast="0"/>
-            <w:bookmarkEnd w:id="26"/>
+            <w:bookmarkStart w:id="36" w:name="_a710llt7r7bq" w:colFirst="0" w:colLast="0"/>
+            <w:bookmarkEnd w:id="36"/>
             <w:r>
               <w:rPr>
                 <w:rFonts w:ascii="Arial" w:eastAsia="Arial" w:hAnsi="Arial" w:cs="Arial"/>
@@ -24586,8 +23985,8 @@
                 <w:szCs w:val="22"/>
               </w:rPr>
             </w:pPr>
-            <w:bookmarkStart w:id="27" w:name="_5e7mkwecvx31" w:colFirst="0" w:colLast="0"/>
-            <w:bookmarkEnd w:id="27"/>
+            <w:bookmarkStart w:id="37" w:name="_5e7mkwecvx31" w:colFirst="0" w:colLast="0"/>
+            <w:bookmarkEnd w:id="37"/>
             <w:r>
               <w:rPr>
                 <w:rFonts w:ascii="Arial" w:eastAsia="Arial" w:hAnsi="Arial" w:cs="Arial"/>
@@ -24607,8 +24006,8 @@
           <w:rFonts w:eastAsia="Arial"/>
         </w:rPr>
       </w:pPr>
-      <w:bookmarkStart w:id="28" w:name="_vrgo1xd4qdn1" w:colFirst="0" w:colLast="0"/>
-      <w:bookmarkEnd w:id="28"/>
+      <w:bookmarkStart w:id="38" w:name="_vrgo1xd4qdn1" w:colFirst="0" w:colLast="0"/>
+      <w:bookmarkEnd w:id="38"/>
     </w:p>
     <w:p>
       <w:pPr>
@@ -24616,8 +24015,8 @@
           <w:rFonts w:eastAsia="Arial"/>
         </w:rPr>
       </w:pPr>
-      <w:bookmarkStart w:id="29" w:name="_jarpfytinpzm" w:colFirst="0" w:colLast="0"/>
-      <w:bookmarkEnd w:id="29"/>
+      <w:bookmarkStart w:id="39" w:name="_jarpfytinpzm" w:colFirst="0" w:colLast="0"/>
+      <w:bookmarkEnd w:id="39"/>
     </w:p>
     <w:tbl>
       <w:tblPr>
@@ -24954,8 +24353,8 @@
                 <w:szCs w:val="22"/>
               </w:rPr>
             </w:pPr>
-            <w:bookmarkStart w:id="30" w:name="_vhggyakolafy" w:colFirst="0" w:colLast="0"/>
-            <w:bookmarkEnd w:id="30"/>
+            <w:bookmarkStart w:id="40" w:name="_vhggyakolafy" w:colFirst="0" w:colLast="0"/>
+            <w:bookmarkEnd w:id="40"/>
             <w:r>
               <w:rPr>
                 <w:rFonts w:ascii="Arial" w:eastAsia="Arial" w:hAnsi="Arial" w:cs="Arial"/>
@@ -25042,8 +24441,8 @@
                 <w:szCs w:val="22"/>
               </w:rPr>
             </w:pPr>
-            <w:bookmarkStart w:id="31" w:name="_mqn8etu4ij7f" w:colFirst="0" w:colLast="0"/>
-            <w:bookmarkEnd w:id="31"/>
+            <w:bookmarkStart w:id="41" w:name="_mqn8etu4ij7f" w:colFirst="0" w:colLast="0"/>
+            <w:bookmarkEnd w:id="41"/>
             <w:r>
               <w:rPr>
                 <w:rFonts w:ascii="Arial" w:eastAsia="Arial" w:hAnsi="Arial" w:cs="Arial"/>
@@ -25069,8 +24468,8 @@
                 <w:szCs w:val="22"/>
               </w:rPr>
             </w:pPr>
-            <w:bookmarkStart w:id="32" w:name="_3e6mviz4mv7u" w:colFirst="0" w:colLast="0"/>
-            <w:bookmarkEnd w:id="32"/>
+            <w:bookmarkStart w:id="42" w:name="_3e6mviz4mv7u" w:colFirst="0" w:colLast="0"/>
+            <w:bookmarkEnd w:id="42"/>
             <w:r>
               <w:rPr>
                 <w:rFonts w:ascii="Arial" w:eastAsia="Arial" w:hAnsi="Arial" w:cs="Arial"/>
@@ -25157,8 +24556,8 @@
                 <w:szCs w:val="22"/>
               </w:rPr>
             </w:pPr>
-            <w:bookmarkStart w:id="33" w:name="_oqwy28l4s8j8" w:colFirst="0" w:colLast="0"/>
-            <w:bookmarkEnd w:id="33"/>
+            <w:bookmarkStart w:id="43" w:name="_oqwy28l4s8j8" w:colFirst="0" w:colLast="0"/>
+            <w:bookmarkEnd w:id="43"/>
             <w:r>
               <w:rPr>
                 <w:rFonts w:ascii="Arial" w:eastAsia="Arial" w:hAnsi="Arial" w:cs="Arial"/>
@@ -25184,8 +24583,8 @@
                 <w:szCs w:val="22"/>
               </w:rPr>
             </w:pPr>
-            <w:bookmarkStart w:id="34" w:name="_nps0vywq6u26" w:colFirst="0" w:colLast="0"/>
-            <w:bookmarkEnd w:id="34"/>
+            <w:bookmarkStart w:id="44" w:name="_nps0vywq6u26" w:colFirst="0" w:colLast="0"/>
+            <w:bookmarkEnd w:id="44"/>
             <w:r>
               <w:rPr>
                 <w:rFonts w:ascii="Arial" w:eastAsia="Arial" w:hAnsi="Arial" w:cs="Arial"/>
@@ -25347,8 +24746,8 @@
                 <w:szCs w:val="22"/>
               </w:rPr>
             </w:pPr>
-            <w:bookmarkStart w:id="35" w:name="_fejpv33d5gjx" w:colFirst="0" w:colLast="0"/>
-            <w:bookmarkEnd w:id="35"/>
+            <w:bookmarkStart w:id="45" w:name="_fejpv33d5gjx" w:colFirst="0" w:colLast="0"/>
+            <w:bookmarkEnd w:id="45"/>
             <w:r>
               <w:rPr>
                 <w:rFonts w:ascii="Arial" w:eastAsia="Arial" w:hAnsi="Arial" w:cs="Arial"/>
@@ -25374,8 +24773,8 @@
                 <w:szCs w:val="22"/>
               </w:rPr>
             </w:pPr>
-            <w:bookmarkStart w:id="36" w:name="_og1lki91wro7" w:colFirst="0" w:colLast="0"/>
-            <w:bookmarkEnd w:id="36"/>
+            <w:bookmarkStart w:id="46" w:name="_og1lki91wro7" w:colFirst="0" w:colLast="0"/>
+            <w:bookmarkEnd w:id="46"/>
             <w:r>
               <w:rPr>
                 <w:rFonts w:ascii="Arial" w:eastAsia="Arial" w:hAnsi="Arial" w:cs="Arial"/>
@@ -25461,8 +24860,8 @@
                 <w:szCs w:val="22"/>
               </w:rPr>
             </w:pPr>
-            <w:bookmarkStart w:id="37" w:name="_w1qdi4lx9inh" w:colFirst="0" w:colLast="0"/>
-            <w:bookmarkEnd w:id="37"/>
+            <w:bookmarkStart w:id="47" w:name="_w1qdi4lx9inh" w:colFirst="0" w:colLast="0"/>
+            <w:bookmarkEnd w:id="47"/>
             <w:r>
               <w:rPr>
                 <w:rFonts w:ascii="Arial" w:eastAsia="Arial" w:hAnsi="Arial" w:cs="Arial"/>
@@ -25550,8 +24949,8 @@
                 <w:szCs w:val="22"/>
               </w:rPr>
             </w:pPr>
-            <w:bookmarkStart w:id="38" w:name="_icm1pzoijrui" w:colFirst="0" w:colLast="0"/>
-            <w:bookmarkEnd w:id="38"/>
+            <w:bookmarkStart w:id="48" w:name="_icm1pzoijrui" w:colFirst="0" w:colLast="0"/>
+            <w:bookmarkEnd w:id="48"/>
             <w:r>
               <w:rPr>
                 <w:rFonts w:ascii="Arial" w:eastAsia="Arial" w:hAnsi="Arial" w:cs="Arial"/>
@@ -25577,8 +24976,8 @@
                 <w:szCs w:val="22"/>
               </w:rPr>
             </w:pPr>
-            <w:bookmarkStart w:id="39" w:name="_9v7k9bfh8ppq" w:colFirst="0" w:colLast="0"/>
-            <w:bookmarkEnd w:id="39"/>
+            <w:bookmarkStart w:id="49" w:name="_9v7k9bfh8ppq" w:colFirst="0" w:colLast="0"/>
+            <w:bookmarkEnd w:id="49"/>
             <w:r>
               <w:rPr>
                 <w:rFonts w:ascii="Arial" w:eastAsia="Arial" w:hAnsi="Arial" w:cs="Arial"/>
@@ -25748,8 +25147,8 @@
                 <w:szCs w:val="22"/>
               </w:rPr>
             </w:pPr>
-            <w:bookmarkStart w:id="40" w:name="_e19wigc471j9" w:colFirst="0" w:colLast="0"/>
-            <w:bookmarkEnd w:id="40"/>
+            <w:bookmarkStart w:id="50" w:name="_e19wigc471j9" w:colFirst="0" w:colLast="0"/>
+            <w:bookmarkEnd w:id="50"/>
             <w:r>
               <w:rPr>
                 <w:rFonts w:ascii="Arial" w:eastAsia="Arial" w:hAnsi="Arial" w:cs="Arial"/>
@@ -25795,8 +25194,8 @@
                 <w:szCs w:val="22"/>
               </w:rPr>
             </w:pPr>
-            <w:bookmarkStart w:id="41" w:name="_59jb22dvcda9" w:colFirst="0" w:colLast="0"/>
-            <w:bookmarkEnd w:id="41"/>
+            <w:bookmarkStart w:id="51" w:name="_59jb22dvcda9" w:colFirst="0" w:colLast="0"/>
+            <w:bookmarkEnd w:id="51"/>
             <w:r>
               <w:rPr>
                 <w:rFonts w:ascii="Arial" w:eastAsia="Arial" w:hAnsi="Arial" w:cs="Arial"/>
@@ -25836,8 +25235,8 @@
                 <w:szCs w:val="22"/>
               </w:rPr>
             </w:pPr>
-            <w:bookmarkStart w:id="42" w:name="_9yhei4r0lsxi" w:colFirst="0" w:colLast="0"/>
-            <w:bookmarkEnd w:id="42"/>
+            <w:bookmarkStart w:id="52" w:name="_9yhei4r0lsxi" w:colFirst="0" w:colLast="0"/>
+            <w:bookmarkEnd w:id="52"/>
             <w:r>
               <w:rPr>
                 <w:rFonts w:ascii="Arial" w:eastAsia="Arial" w:hAnsi="Arial" w:cs="Arial"/>
@@ -26188,8 +25587,8 @@
                 <w:szCs w:val="22"/>
               </w:rPr>
             </w:pPr>
-            <w:bookmarkStart w:id="43" w:name="_qx5ttcjjkjaq" w:colFirst="0" w:colLast="0"/>
-            <w:bookmarkEnd w:id="43"/>
+            <w:bookmarkStart w:id="53" w:name="_qx5ttcjjkjaq" w:colFirst="0" w:colLast="0"/>
+            <w:bookmarkEnd w:id="53"/>
             <w:r>
               <w:rPr>
                 <w:rFonts w:ascii="Arial" w:eastAsia="Arial" w:hAnsi="Arial" w:cs="Arial"/>
@@ -26275,8 +25674,8 @@
                 <w:szCs w:val="22"/>
               </w:rPr>
             </w:pPr>
-            <w:bookmarkStart w:id="44" w:name="_bl41l76ib6al" w:colFirst="0" w:colLast="0"/>
-            <w:bookmarkEnd w:id="44"/>
+            <w:bookmarkStart w:id="54" w:name="_bl41l76ib6al" w:colFirst="0" w:colLast="0"/>
+            <w:bookmarkEnd w:id="54"/>
             <w:r>
               <w:rPr>
                 <w:rFonts w:ascii="Arial" w:eastAsia="Arial" w:hAnsi="Arial" w:cs="Arial"/>
@@ -26363,8 +25762,8 @@
                 <w:szCs w:val="22"/>
               </w:rPr>
             </w:pPr>
-            <w:bookmarkStart w:id="45" w:name="_zg3tuvgqlkau" w:colFirst="0" w:colLast="0"/>
-            <w:bookmarkEnd w:id="45"/>
+            <w:bookmarkStart w:id="55" w:name="_zg3tuvgqlkau" w:colFirst="0" w:colLast="0"/>
+            <w:bookmarkEnd w:id="55"/>
             <w:r>
               <w:rPr>
                 <w:rFonts w:ascii="Arial" w:eastAsia="Arial" w:hAnsi="Arial" w:cs="Arial"/>
@@ -26390,8 +25789,8 @@
                 <w:szCs w:val="22"/>
               </w:rPr>
             </w:pPr>
-            <w:bookmarkStart w:id="46" w:name="_wtzwepeccrgn" w:colFirst="0" w:colLast="0"/>
-            <w:bookmarkEnd w:id="46"/>
+            <w:bookmarkStart w:id="56" w:name="_wtzwepeccrgn" w:colFirst="0" w:colLast="0"/>
+            <w:bookmarkEnd w:id="56"/>
             <w:r>
               <w:rPr>
                 <w:rFonts w:ascii="Arial" w:eastAsia="Arial" w:hAnsi="Arial" w:cs="Arial"/>
@@ -26528,8 +25927,8 @@
                 <w:szCs w:val="22"/>
               </w:rPr>
             </w:pPr>
-            <w:bookmarkStart w:id="47" w:name="_eyjsx22k37ay" w:colFirst="0" w:colLast="0"/>
-            <w:bookmarkEnd w:id="47"/>
+            <w:bookmarkStart w:id="57" w:name="_eyjsx22k37ay" w:colFirst="0" w:colLast="0"/>
+            <w:bookmarkEnd w:id="57"/>
             <w:r>
               <w:rPr>
                 <w:rFonts w:ascii="Arial" w:eastAsia="Arial" w:hAnsi="Arial" w:cs="Arial"/>
@@ -26555,8 +25954,8 @@
                 <w:szCs w:val="22"/>
               </w:rPr>
             </w:pPr>
-            <w:bookmarkStart w:id="48" w:name="_eerb9xonqet1" w:colFirst="0" w:colLast="0"/>
-            <w:bookmarkEnd w:id="48"/>
+            <w:bookmarkStart w:id="58" w:name="_eerb9xonqet1" w:colFirst="0" w:colLast="0"/>
+            <w:bookmarkEnd w:id="58"/>
             <w:r>
               <w:rPr>
                 <w:rFonts w:ascii="Arial" w:eastAsia="Arial" w:hAnsi="Arial" w:cs="Arial"/>
@@ -26642,8 +26041,8 @@
                 <w:szCs w:val="22"/>
               </w:rPr>
             </w:pPr>
-            <w:bookmarkStart w:id="49" w:name="_f863g67o7ws" w:colFirst="0" w:colLast="0"/>
-            <w:bookmarkEnd w:id="49"/>
+            <w:bookmarkStart w:id="59" w:name="_f863g67o7ws" w:colFirst="0" w:colLast="0"/>
+            <w:bookmarkEnd w:id="59"/>
             <w:r>
               <w:rPr>
                 <w:rFonts w:ascii="Arial" w:eastAsia="Arial" w:hAnsi="Arial" w:cs="Arial"/>
@@ -26731,8 +26130,8 @@
                 <w:szCs w:val="22"/>
               </w:rPr>
             </w:pPr>
-            <w:bookmarkStart w:id="50" w:name="_8z3p24fqvhgq" w:colFirst="0" w:colLast="0"/>
-            <w:bookmarkEnd w:id="50"/>
+            <w:bookmarkStart w:id="60" w:name="_8z3p24fqvhgq" w:colFirst="0" w:colLast="0"/>
+            <w:bookmarkEnd w:id="60"/>
             <w:r>
               <w:rPr>
                 <w:rFonts w:ascii="Arial" w:eastAsia="Arial" w:hAnsi="Arial" w:cs="Arial"/>
@@ -26758,8 +26157,8 @@
                 <w:szCs w:val="22"/>
               </w:rPr>
             </w:pPr>
-            <w:bookmarkStart w:id="51" w:name="_m9f9axac6nnu" w:colFirst="0" w:colLast="0"/>
-            <w:bookmarkEnd w:id="51"/>
+            <w:bookmarkStart w:id="61" w:name="_m9f9axac6nnu" w:colFirst="0" w:colLast="0"/>
+            <w:bookmarkEnd w:id="61"/>
             <w:r>
               <w:rPr>
                 <w:rFonts w:ascii="Arial" w:eastAsia="Arial" w:hAnsi="Arial" w:cs="Arial"/>
@@ -26844,8 +26243,8 @@
                 <w:szCs w:val="22"/>
               </w:rPr>
             </w:pPr>
-            <w:bookmarkStart w:id="52" w:name="_7s0ogbmaq4pa" w:colFirst="0" w:colLast="0"/>
-            <w:bookmarkEnd w:id="52"/>
+            <w:bookmarkStart w:id="62" w:name="_7s0ogbmaq4pa" w:colFirst="0" w:colLast="0"/>
+            <w:bookmarkEnd w:id="62"/>
             <w:r>
               <w:rPr>
                 <w:rFonts w:ascii="Arial" w:eastAsia="Arial" w:hAnsi="Arial" w:cs="Arial"/>
@@ -26891,8 +26290,8 @@
                 <w:szCs w:val="22"/>
               </w:rPr>
             </w:pPr>
-            <w:bookmarkStart w:id="53" w:name="_912jgynfpgd7" w:colFirst="0" w:colLast="0"/>
-            <w:bookmarkEnd w:id="53"/>
+            <w:bookmarkStart w:id="63" w:name="_912jgynfpgd7" w:colFirst="0" w:colLast="0"/>
+            <w:bookmarkEnd w:id="63"/>
             <w:r>
               <w:rPr>
                 <w:rFonts w:ascii="Arial" w:eastAsia="Arial" w:hAnsi="Arial" w:cs="Arial"/>
@@ -26933,8 +26332,8 @@
                 <w:szCs w:val="22"/>
               </w:rPr>
             </w:pPr>
-            <w:bookmarkStart w:id="54" w:name="_rmhchvaaiey5" w:colFirst="0" w:colLast="0"/>
-            <w:bookmarkEnd w:id="54"/>
+            <w:bookmarkStart w:id="64" w:name="_rmhchvaaiey5" w:colFirst="0" w:colLast="0"/>
+            <w:bookmarkEnd w:id="64"/>
             <w:r>
               <w:rPr>
                 <w:rFonts w:ascii="Arial" w:eastAsia="Arial" w:hAnsi="Arial" w:cs="Arial"/>
@@ -26980,8 +26379,8 @@
                 <w:szCs w:val="22"/>
               </w:rPr>
             </w:pPr>
-            <w:bookmarkStart w:id="55" w:name="_x6xdqnof1z4t" w:colFirst="0" w:colLast="0"/>
-            <w:bookmarkEnd w:id="55"/>
+            <w:bookmarkStart w:id="65" w:name="_x6xdqnof1z4t" w:colFirst="0" w:colLast="0"/>
+            <w:bookmarkEnd w:id="65"/>
             <w:r>
               <w:rPr>
                 <w:rFonts w:ascii="Arial" w:eastAsia="Arial" w:hAnsi="Arial" w:cs="Arial"/>
@@ -27021,8 +26420,8 @@
                 <w:szCs w:val="22"/>
               </w:rPr>
             </w:pPr>
-            <w:bookmarkStart w:id="56" w:name="_6yc7nkjkkao7" w:colFirst="0" w:colLast="0"/>
-            <w:bookmarkEnd w:id="56"/>
+            <w:bookmarkStart w:id="66" w:name="_6yc7nkjkkao7" w:colFirst="0" w:colLast="0"/>
+            <w:bookmarkEnd w:id="66"/>
             <w:r>
               <w:rPr>
                 <w:rFonts w:ascii="Arial" w:eastAsia="Arial" w:hAnsi="Arial" w:cs="Arial"/>
@@ -27047,8 +26446,8 @@
           <w:szCs w:val="22"/>
         </w:rPr>
       </w:pPr>
-      <w:bookmarkStart w:id="57" w:name="_32yupwq9ealm" w:colFirst="0" w:colLast="0"/>
-      <w:bookmarkEnd w:id="57"/>
+      <w:bookmarkStart w:id="67" w:name="_32yupwq9ealm" w:colFirst="0" w:colLast="0"/>
+      <w:bookmarkEnd w:id="67"/>
     </w:p>
     <w:p>
       <w:pPr>
@@ -27069,8 +26468,8 @@
         </w:numPr>
         <w:jc w:val="both"/>
       </w:pPr>
-      <w:bookmarkStart w:id="58" w:name="_dmjaof4a5qyp" w:colFirst="0" w:colLast="0"/>
-      <w:bookmarkEnd w:id="58"/>
+      <w:bookmarkStart w:id="68" w:name="_dmjaof4a5qyp" w:colFirst="0" w:colLast="0"/>
+      <w:bookmarkEnd w:id="68"/>
       <w:r>
         <w:t>Módulo de Reportes</w:t>
       </w:r>
@@ -27696,25 +27095,7 @@
                 <w:sz w:val="22"/>
                 <w:szCs w:val="22"/>
               </w:rPr>
-              <w:t xml:space="preserve">Elige el tipo de filtro de fecha (día, semana, mes, </w:t>
-            </w:r>
-            <w:proofErr w:type="gramStart"/>
-            <w:r>
-              <w:rPr>
-                <w:rFonts w:ascii="Arial" w:eastAsia="Arial" w:hAnsi="Arial" w:cs="Arial"/>
-                <w:sz w:val="22"/>
-                <w:szCs w:val="22"/>
-              </w:rPr>
-              <w:t>etc...</w:t>
-            </w:r>
-            <w:proofErr w:type="gramEnd"/>
-            <w:r>
-              <w:rPr>
-                <w:rFonts w:ascii="Arial" w:eastAsia="Arial" w:hAnsi="Arial" w:cs="Arial"/>
-                <w:sz w:val="22"/>
-                <w:szCs w:val="22"/>
-              </w:rPr>
-              <w:t>).</w:t>
+              <w:t>Elige el tipo de filtro de fecha (día, semana, mes, etc...).</w:t>
             </w:r>
           </w:p>
           <w:p>
@@ -28211,8 +27592,8 @@
         <w:pStyle w:val="Ttulo2"/>
         <w:jc w:val="both"/>
       </w:pPr>
-      <w:bookmarkStart w:id="59" w:name="_88tagvbvmbj" w:colFirst="0" w:colLast="0"/>
-      <w:bookmarkEnd w:id="59"/>
+      <w:bookmarkStart w:id="69" w:name="_88tagvbvmbj" w:colFirst="0" w:colLast="0"/>
+      <w:bookmarkEnd w:id="69"/>
     </w:p>
     <w:tbl>
       <w:tblPr>
@@ -29367,8 +28748,8 @@
         <w:pStyle w:val="Ttulo2"/>
         <w:jc w:val="both"/>
       </w:pPr>
-      <w:bookmarkStart w:id="60" w:name="_dv8ldrrid9rd" w:colFirst="0" w:colLast="0"/>
-      <w:bookmarkEnd w:id="60"/>
+      <w:bookmarkStart w:id="70" w:name="_dv8ldrrid9rd" w:colFirst="0" w:colLast="0"/>
+      <w:bookmarkEnd w:id="70"/>
     </w:p>
     <w:tbl>
       <w:tblPr>
@@ -30488,8 +29869,8 @@
         <w:pStyle w:val="Ttulo2"/>
         <w:jc w:val="both"/>
       </w:pPr>
-      <w:bookmarkStart w:id="61" w:name="_rcp8w8rm6c07" w:colFirst="0" w:colLast="0"/>
-      <w:bookmarkEnd w:id="61"/>
+      <w:bookmarkStart w:id="71" w:name="_rcp8w8rm6c07" w:colFirst="0" w:colLast="0"/>
+      <w:bookmarkEnd w:id="71"/>
     </w:p>
     <w:tbl>
       <w:tblPr>
@@ -31623,8 +31004,8 @@
         </w:numPr>
         <w:jc w:val="both"/>
       </w:pPr>
-      <w:bookmarkStart w:id="62" w:name="_xjd4po2tsu5v" w:colFirst="0" w:colLast="0"/>
-      <w:bookmarkEnd w:id="62"/>
+      <w:bookmarkStart w:id="72" w:name="_xjd4po2tsu5v" w:colFirst="0" w:colLast="0"/>
+      <w:bookmarkEnd w:id="72"/>
       <w:r>
         <w:t>Módulo de Proveedores</w:t>
       </w:r>
@@ -32253,7 +31634,7 @@
               </w:rPr>
               <w:t xml:space="preserve">El administrador completa el formulario con </w:t>
             </w:r>
-            <w:commentRangeStart w:id="63"/>
+            <w:commentRangeStart w:id="73"/>
             <w:r>
               <w:rPr>
                 <w:rFonts w:ascii="Arial" w:eastAsia="Arial" w:hAnsi="Arial" w:cs="Arial"/>
@@ -32262,9 +31643,15 @@
               </w:rPr>
               <w:t>sus respectivos datos</w:t>
             </w:r>
-            <w:commentRangeEnd w:id="63"/>
-            <w:r>
-              <w:commentReference w:id="63"/>
+            <w:commentRangeEnd w:id="73"/>
+            <w:r>
+              <w:rPr>
+                <w:rStyle w:val="Refdecomentario"/>
+                <w:rFonts w:ascii="Arial" w:eastAsia="Arial" w:hAnsi="Arial" w:cs="Arial"/>
+                <w:sz w:val="22"/>
+                <w:szCs w:val="22"/>
+              </w:rPr>
+              <w:commentReference w:id="73"/>
             </w:r>
             <w:r>
               <w:rPr>
@@ -32768,8 +32155,8 @@
         <w:pStyle w:val="Ttulo2"/>
         <w:jc w:val="both"/>
       </w:pPr>
-      <w:bookmarkStart w:id="64" w:name="_1mx40z5wxjql" w:colFirst="0" w:colLast="0"/>
-      <w:bookmarkEnd w:id="64"/>
+      <w:bookmarkStart w:id="74" w:name="_1mx40z5wxjql" w:colFirst="0" w:colLast="0"/>
+      <w:bookmarkEnd w:id="74"/>
     </w:p>
     <w:tbl>
       <w:tblPr>
@@ -33888,8 +33275,8 @@
         <w:pStyle w:val="Ttulo2"/>
         <w:jc w:val="both"/>
       </w:pPr>
-      <w:bookmarkStart w:id="65" w:name="_3jhsxuufdmc9" w:colFirst="0" w:colLast="0"/>
-      <w:bookmarkEnd w:id="65"/>
+      <w:bookmarkStart w:id="75" w:name="_3jhsxuufdmc9" w:colFirst="0" w:colLast="0"/>
+      <w:bookmarkEnd w:id="75"/>
     </w:p>
     <w:tbl>
       <w:tblPr>
@@ -34286,23 +33673,13 @@
                 <w:szCs w:val="22"/>
               </w:rPr>
             </w:pPr>
-            <w:proofErr w:type="gramStart"/>
-            <w:r>
-              <w:rPr>
-                <w:rFonts w:ascii="Arial" w:eastAsia="Arial" w:hAnsi="Arial" w:cs="Arial"/>
-                <w:sz w:val="22"/>
-                <w:szCs w:val="22"/>
-              </w:rPr>
-              <w:t>El proveedor a editar</w:t>
-            </w:r>
-            <w:proofErr w:type="gramEnd"/>
-            <w:r>
-              <w:rPr>
-                <w:rFonts w:ascii="Arial" w:eastAsia="Arial" w:hAnsi="Arial" w:cs="Arial"/>
-                <w:sz w:val="22"/>
-                <w:szCs w:val="22"/>
-              </w:rPr>
-              <w:t xml:space="preserve"> debe existir en el sistema.</w:t>
+            <w:r>
+              <w:rPr>
+                <w:rFonts w:ascii="Arial" w:eastAsia="Arial" w:hAnsi="Arial" w:cs="Arial"/>
+                <w:sz w:val="22"/>
+                <w:szCs w:val="22"/>
+              </w:rPr>
+              <w:t>El proveedor a editar debe existir en el sistema.</w:t>
             </w:r>
           </w:p>
         </w:tc>
@@ -35067,7 +34444,7 @@
       </w:pPr>
     </w:p>
     <w:sectPr>
-      <w:headerReference w:type="default" r:id="rId14"/>
+      <w:headerReference w:type="default" r:id="rId15"/>
       <w:pgSz w:w="12240" w:h="15840"/>
       <w:pgMar w:top="1440" w:right="1296" w:bottom="1440" w:left="1296" w:header="720" w:footer="720" w:gutter="0"/>
       <w:pgNumType w:start="1"/>
@@ -35079,7 +34456,39 @@
 
 <file path=word/comments.xml><?xml version="1.0" encoding="utf-8"?>
 <w:comments xmlns:wpc="http://schemas.microsoft.com/office/word/2010/wordprocessingCanvas" xmlns:cx="http://schemas.microsoft.com/office/drawing/2014/chartex" xmlns:cx1="http://schemas.microsoft.com/office/drawing/2015/9/8/chartex" xmlns:cx2="http://schemas.microsoft.com/office/drawing/2015/10/21/chartex" xmlns:cx3="http://schemas.microsoft.com/office/drawing/2016/5/9/chartex" xmlns:cx4="http://schemas.microsoft.com/office/drawing/2016/5/10/chartex" xmlns:cx5="http://schemas.microsoft.com/office/drawing/2016/5/11/chartex" xmlns:cx6="http://schemas.microsoft.com/office/drawing/2016/5/12/chartex" xmlns:cx7="http://schemas.microsoft.com/office/drawing/2016/5/13/chartex" xmlns:cx8="http://schemas.microsoft.com/office/drawing/2016/5/14/chartex" xmlns:mc="http://schemas.openxmlformats.org/markup-compatibility/2006" xmlns:aink="http://schemas.microsoft.com/office/drawing/2016/ink" xmlns:am3d="http://schemas.microsoft.com/office/drawing/2017/model3d" xmlns:o="urn:schemas-microsoft-com:office:office" xmlns:oel="http://schemas.microsoft.com/office/2019/extlst" xmlns:r="http://schemas.openxmlformats.org/officeDocument/2006/relationships" xmlns:m="http://schemas.openxmlformats.org/officeDocument/2006/math" xmlns:v="urn:schemas-microsoft-com:vml" xmlns:wp14="http://schemas.microsoft.com/office/word/2010/wordprocessingDrawing" xmlns:wp="http://schemas.openxmlformats.org/drawingml/2006/wordprocessingDrawing" xmlns:w10="urn:schemas-microsoft-com:office:word" xmlns:w="http://schemas.openxmlformats.org/wordprocessingml/2006/main" xmlns:w14="http://schemas.microsoft.com/office/word/2010/wordml" xmlns:w15="http://schemas.microsoft.com/office/word/2012/wordml" xmlns:w16cex="http://schemas.microsoft.com/office/word/2018/wordml/cex" xmlns:w16cid="http://schemas.microsoft.com/office/word/2016/wordml/cid" xmlns:w16="http://schemas.microsoft.com/office/word/2018/wordml" xmlns:w16du="http://schemas.microsoft.com/office/word/2023/wordml/word16du" xmlns:w16sdtdh="http://schemas.microsoft.com/office/word/2020/wordml/sdtdatahash" xmlns:w16sdtfl="http://schemas.microsoft.com/office/word/2024/wordml/sdtformatlock" xmlns:w16se="http://schemas.microsoft.com/office/word/2015/wordml/symex" xmlns:wpg="http://schemas.microsoft.com/office/word/2010/wordprocessingGroup" xmlns:wpi="http://schemas.microsoft.com/office/word/2010/wordprocessingInk" xmlns:wne="http://schemas.microsoft.com/office/word/2006/wordml" xmlns:wps="http://schemas.microsoft.com/office/word/2010/wordprocessingShape" mc:Ignorable="w14 w15 w16se w16cid w16 w16cex w16sdtdh w16sdtfl w16du wp14">
-  <w:comment w:id="63" w:author="Isaac Herrera" w:date="2025-06-04T04:43:00Z" w:initials="">
+  <w:comment w:id="10" w:author="MELANIE OVIEDO MALEA�O" w:date="2025-07-31T14:28:00Z" w:initials="MO">
+    <w:p>
+      <w:pPr>
+        <w:pStyle w:val="Textocomentario"/>
+      </w:pPr>
+      <w:r>
+        <w:rPr>
+          <w:rStyle w:val="Refdecomentario"/>
+        </w:rPr>
+        <w:annotationRef/>
+      </w:r>
+      <w:r>
+        <w:t>Lo que esta marcado es lo que hace el sistema por ende el actor es el sistema</w:t>
+      </w:r>
+    </w:p>
+  </w:comment>
+  <w:comment w:id="11" w:author="MELANIE OVIEDO MALEA�O" w:date="2025-07-31T14:45:00Z" w:initials="MO">
+    <w:p>
+      <w:pPr>
+        <w:pStyle w:val="Textocomentario"/>
+      </w:pPr>
+      <w:r>
+        <w:rPr>
+          <w:rStyle w:val="Refdecomentario"/>
+        </w:rPr>
+        <w:annotationRef/>
+      </w:r>
+      <w:r>
+        <w:t>Modificar y separar las funciones y ponerlas individual mente</w:t>
+      </w:r>
+    </w:p>
+  </w:comment>
+  <w:comment w:id="73" w:author="Isaac Herrera" w:date="2025-06-04T04:43:00Z" w:initials="">
     <w:p>
       <w:pPr>
         <w:widowControl w:val="0"/>
@@ -35097,6 +34506,12 @@
           <w:szCs w:val="22"/>
         </w:rPr>
       </w:pPr>
+      <w:r>
+        <w:rPr>
+          <w:rStyle w:val="Refdecomentario"/>
+        </w:rPr>
+        <w:annotationRef/>
+      </w:r>
       <w:r>
         <w:rPr>
           <w:rFonts w:ascii="Arial" w:eastAsia="Arial" w:hAnsi="Arial" w:cs="Arial"/>
@@ -35113,12 +34528,23 @@
 
 <file path=word/commentsExtended.xml><?xml version="1.0" encoding="utf-8"?>
 <w15:commentsEx xmlns:wpc="http://schemas.microsoft.com/office/word/2010/wordprocessingCanvas" xmlns:cx="http://schemas.microsoft.com/office/drawing/2014/chartex" xmlns:cx1="http://schemas.microsoft.com/office/drawing/2015/9/8/chartex" xmlns:cx2="http://schemas.microsoft.com/office/drawing/2015/10/21/chartex" xmlns:cx3="http://schemas.microsoft.com/office/drawing/2016/5/9/chartex" xmlns:cx4="http://schemas.microsoft.com/office/drawing/2016/5/10/chartex" xmlns:cx5="http://schemas.microsoft.com/office/drawing/2016/5/11/chartex" xmlns:cx6="http://schemas.microsoft.com/office/drawing/2016/5/12/chartex" xmlns:cx7="http://schemas.microsoft.com/office/drawing/2016/5/13/chartex" xmlns:cx8="http://schemas.microsoft.com/office/drawing/2016/5/14/chartex" xmlns:mc="http://schemas.openxmlformats.org/markup-compatibility/2006" xmlns:aink="http://schemas.microsoft.com/office/drawing/2016/ink" xmlns:am3d="http://schemas.microsoft.com/office/drawing/2017/model3d" xmlns:o="urn:schemas-microsoft-com:office:office" xmlns:oel="http://schemas.microsoft.com/office/2019/extlst" xmlns:r="http://schemas.openxmlformats.org/officeDocument/2006/relationships" xmlns:m="http://schemas.openxmlformats.org/officeDocument/2006/math" xmlns:v="urn:schemas-microsoft-com:vml" xmlns:wp14="http://schemas.microsoft.com/office/word/2010/wordprocessingDrawing" xmlns:wp="http://schemas.openxmlformats.org/drawingml/2006/wordprocessingDrawing" xmlns:w10="urn:schemas-microsoft-com:office:word" xmlns:w="http://schemas.openxmlformats.org/wordprocessingml/2006/main" xmlns:w14="http://schemas.microsoft.com/office/word/2010/wordml" xmlns:w15="http://schemas.microsoft.com/office/word/2012/wordml" xmlns:w16cex="http://schemas.microsoft.com/office/word/2018/wordml/cex" xmlns:w16cid="http://schemas.microsoft.com/office/word/2016/wordml/cid" xmlns:w16="http://schemas.microsoft.com/office/word/2018/wordml" xmlns:w16du="http://schemas.microsoft.com/office/word/2023/wordml/word16du" xmlns:w16sdtdh="http://schemas.microsoft.com/office/word/2020/wordml/sdtdatahash" xmlns:w16sdtfl="http://schemas.microsoft.com/office/word/2024/wordml/sdtformatlock" xmlns:w16se="http://schemas.microsoft.com/office/word/2015/wordml/symex" xmlns:wpg="http://schemas.microsoft.com/office/word/2010/wordprocessingGroup" xmlns:wpi="http://schemas.microsoft.com/office/word/2010/wordprocessingInk" xmlns:wne="http://schemas.microsoft.com/office/word/2006/wordml" xmlns:wps="http://schemas.microsoft.com/office/word/2010/wordprocessingShape" mc:Ignorable="w14 w15 w16se w16cid w16 w16cex w16sdtdh w16sdtfl w16du wp14">
+  <w15:commentEx w15:paraId="2C8D8136" w15:done="0"/>
+  <w15:commentEx w15:paraId="0EB5E63A" w15:done="0"/>
   <w15:commentEx w15:paraId="49A900F3" w15:done="0"/>
 </w15:commentsEx>
 </file>
 
+<file path=word/commentsExtensible.xml><?xml version="1.0" encoding="utf-8"?>
+<w16cex:commentsExtensible xmlns:wpc="http://schemas.microsoft.com/office/word/2010/wordprocessingCanvas" xmlns:cx="http://schemas.microsoft.com/office/drawing/2014/chartex" xmlns:cx1="http://schemas.microsoft.com/office/drawing/2015/9/8/chartex" xmlns:cx2="http://schemas.microsoft.com/office/drawing/2015/10/21/chartex" xmlns:cx3="http://schemas.microsoft.com/office/drawing/2016/5/9/chartex" xmlns:cx4="http://schemas.microsoft.com/office/drawing/2016/5/10/chartex" xmlns:cx5="http://schemas.microsoft.com/office/drawing/2016/5/11/chartex" xmlns:cx6="http://schemas.microsoft.com/office/drawing/2016/5/12/chartex" xmlns:cx7="http://schemas.microsoft.com/office/drawing/2016/5/13/chartex" xmlns:cx8="http://schemas.microsoft.com/office/drawing/2016/5/14/chartex" xmlns:cr="http://schemas.microsoft.com/office/comments/2020/reactions" xmlns:mc="http://schemas.openxmlformats.org/markup-compatibility/2006" xmlns:aink="http://schemas.microsoft.com/office/drawing/2016/ink" xmlns:am3d="http://schemas.microsoft.com/office/drawing/2017/model3d" xmlns:o="urn:schemas-microsoft-com:office:office" xmlns:oel="http://schemas.microsoft.com/office/2019/extlst" xmlns:r="http://schemas.openxmlformats.org/officeDocument/2006/relationships" xmlns:m="http://schemas.openxmlformats.org/officeDocument/2006/math" xmlns:v="urn:schemas-microsoft-com:vml" xmlns:wp14="http://schemas.microsoft.com/office/word/2010/wordprocessingDrawing" xmlns:wp="http://schemas.openxmlformats.org/drawingml/2006/wordprocessingDrawing" xmlns:w10="urn:schemas-microsoft-com:office:word" xmlns:w="http://schemas.openxmlformats.org/wordprocessingml/2006/main" xmlns:w14="http://schemas.microsoft.com/office/word/2010/wordml" xmlns:w15="http://schemas.microsoft.com/office/word/2012/wordml" xmlns:w16cex="http://schemas.microsoft.com/office/word/2018/wordml/cex" xmlns:w16cid="http://schemas.microsoft.com/office/word/2016/wordml/cid" xmlns:w16="http://schemas.microsoft.com/office/word/2018/wordml" xmlns:w16du="http://schemas.microsoft.com/office/word/2023/wordml/word16du" xmlns:w16sdtdh="http://schemas.microsoft.com/office/word/2020/wordml/sdtdatahash" xmlns:w16sdtfl="http://schemas.microsoft.com/office/word/2024/wordml/sdtformatlock" xmlns:w16se="http://schemas.microsoft.com/office/word/2015/wordml/symex" xmlns:wpg="http://schemas.microsoft.com/office/word/2010/wordprocessingGroup" xmlns:wpi="http://schemas.microsoft.com/office/word/2010/wordprocessingInk" xmlns:wne="http://schemas.microsoft.com/office/word/2006/wordml" xmlns:wps="http://schemas.microsoft.com/office/word/2010/wordprocessingShape" mc:Ignorable="w14 w15 w16se w16cid w16 w16cex w16sdtdh w16sdtfl cr w16du wp14">
+  <w16cex:commentExtensible w16cex:durableId="777390E5" w16cex:dateUtc="2025-07-31T20:28:00Z"/>
+  <w16cex:commentExtensible w16cex:durableId="486870EA" w16cex:dateUtc="2025-07-31T20:45:00Z"/>
+</w16cex:commentsExtensible>
+</file>
+
 <file path=word/commentsIds.xml><?xml version="1.0" encoding="utf-8"?>
 <w16cid:commentsIds xmlns:wpc="http://schemas.microsoft.com/office/word/2010/wordprocessingCanvas" xmlns:cx="http://schemas.microsoft.com/office/drawing/2014/chartex" xmlns:cx1="http://schemas.microsoft.com/office/drawing/2015/9/8/chartex" xmlns:cx2="http://schemas.microsoft.com/office/drawing/2015/10/21/chartex" xmlns:cx3="http://schemas.microsoft.com/office/drawing/2016/5/9/chartex" xmlns:cx4="http://schemas.microsoft.com/office/drawing/2016/5/10/chartex" xmlns:cx5="http://schemas.microsoft.com/office/drawing/2016/5/11/chartex" xmlns:cx6="http://schemas.microsoft.com/office/drawing/2016/5/12/chartex" xmlns:cx7="http://schemas.microsoft.com/office/drawing/2016/5/13/chartex" xmlns:cx8="http://schemas.microsoft.com/office/drawing/2016/5/14/chartex" xmlns:mc="http://schemas.openxmlformats.org/markup-compatibility/2006" xmlns:aink="http://schemas.microsoft.com/office/drawing/2016/ink" xmlns:am3d="http://schemas.microsoft.com/office/drawing/2017/model3d" xmlns:o="urn:schemas-microsoft-com:office:office" xmlns:oel="http://schemas.microsoft.com/office/2019/extlst" xmlns:r="http://schemas.openxmlformats.org/officeDocument/2006/relationships" xmlns:m="http://schemas.openxmlformats.org/officeDocument/2006/math" xmlns:v="urn:schemas-microsoft-com:vml" xmlns:wp14="http://schemas.microsoft.com/office/word/2010/wordprocessingDrawing" xmlns:wp="http://schemas.openxmlformats.org/drawingml/2006/wordprocessingDrawing" xmlns:w10="urn:schemas-microsoft-com:office:word" xmlns:w="http://schemas.openxmlformats.org/wordprocessingml/2006/main" xmlns:w14="http://schemas.microsoft.com/office/word/2010/wordml" xmlns:w15="http://schemas.microsoft.com/office/word/2012/wordml" xmlns:w16cex="http://schemas.microsoft.com/office/word/2018/wordml/cex" xmlns:w16cid="http://schemas.microsoft.com/office/word/2016/wordml/cid" xmlns:w16="http://schemas.microsoft.com/office/word/2018/wordml" xmlns:w16du="http://schemas.microsoft.com/office/word/2023/wordml/word16du" xmlns:w16sdtdh="http://schemas.microsoft.com/office/word/2020/wordml/sdtdatahash" xmlns:w16sdtfl="http://schemas.microsoft.com/office/word/2024/wordml/sdtformatlock" xmlns:w16se="http://schemas.microsoft.com/office/word/2015/wordml/symex" xmlns:wpg="http://schemas.microsoft.com/office/word/2010/wordprocessingGroup" xmlns:wpi="http://schemas.microsoft.com/office/word/2010/wordprocessingInk" xmlns:wne="http://schemas.microsoft.com/office/word/2006/wordml" xmlns:wps="http://schemas.microsoft.com/office/word/2010/wordprocessingShape" mc:Ignorable="w14 w15 w16se w16cid w16 w16cex w16sdtdh w16sdtfl w16du wp14">
+  <w16cid:commentId w16cid:paraId="2C8D8136" w16cid:durableId="777390E5"/>
+  <w16cid:commentId w16cid:paraId="0EB5E63A" w16cid:durableId="486870EA"/>
   <w16cid:commentId w16cid:paraId="49A900F3" w16cid:durableId="113296E6"/>
 </w16cid:commentsIds>
 </file>
@@ -35173,73 +34599,7 @@
         <w:sz w:val="20"/>
         <w:szCs w:val="20"/>
       </w:rPr>
-      <w:t xml:space="preserve">Derechos de autor © 2023 por Karl </w:t>
-    </w:r>
-    <w:proofErr w:type="spellStart"/>
-    <w:r>
-      <w:rPr>
-        <w:b/>
-        <w:i/>
-        <w:color w:val="000000"/>
-        <w:sz w:val="20"/>
-        <w:szCs w:val="20"/>
-      </w:rPr>
-      <w:t>Wiegers</w:t>
-    </w:r>
-    <w:proofErr w:type="spellEnd"/>
-    <w:r>
-      <w:rPr>
-        <w:b/>
-        <w:i/>
-        <w:color w:val="000000"/>
-        <w:sz w:val="20"/>
-        <w:szCs w:val="20"/>
-      </w:rPr>
-      <w:t xml:space="preserve"> y </w:t>
-    </w:r>
-    <w:proofErr w:type="spellStart"/>
-    <w:r>
-      <w:rPr>
-        <w:b/>
-        <w:i/>
-        <w:color w:val="000000"/>
-        <w:sz w:val="20"/>
-        <w:szCs w:val="20"/>
-      </w:rPr>
-      <w:t>Seilevel</w:t>
-    </w:r>
-    <w:proofErr w:type="spellEnd"/>
-    <w:r>
-      <w:rPr>
-        <w:b/>
-        <w:i/>
-        <w:color w:val="000000"/>
-        <w:sz w:val="20"/>
-        <w:szCs w:val="20"/>
-      </w:rPr>
-      <w:t xml:space="preserve"> </w:t>
-    </w:r>
-    <w:proofErr w:type="spellStart"/>
-    <w:r>
-      <w:rPr>
-        <w:b/>
-        <w:i/>
-        <w:color w:val="000000"/>
-        <w:sz w:val="20"/>
-        <w:szCs w:val="20"/>
-      </w:rPr>
-      <w:t>Partners</w:t>
-    </w:r>
-    <w:proofErr w:type="spellEnd"/>
-    <w:r>
-      <w:rPr>
-        <w:b/>
-        <w:i/>
-        <w:color w:val="000000"/>
-        <w:sz w:val="20"/>
-        <w:szCs w:val="20"/>
-      </w:rPr>
-      <w:t xml:space="preserve"> LP. Se concede permiso para usar y modificar.</w:t>
+      <w:t>Derechos de autor © 2023 por Karl Wiegers y Seilevel Partners LP. Se concede permiso para usar y modificar.</w:t>
     </w:r>
   </w:p>
 </w:ftr>
@@ -35276,73 +34636,7 @@
         <w:sz w:val="20"/>
         <w:szCs w:val="20"/>
       </w:rPr>
-      <w:t xml:space="preserve">Derechos de autor © 2023 por Karl </w:t>
-    </w:r>
-    <w:proofErr w:type="spellStart"/>
-    <w:r>
-      <w:rPr>
-        <w:b/>
-        <w:i/>
-        <w:color w:val="000000"/>
-        <w:sz w:val="20"/>
-        <w:szCs w:val="20"/>
-      </w:rPr>
-      <w:t>Wiegers</w:t>
-    </w:r>
-    <w:proofErr w:type="spellEnd"/>
-    <w:r>
-      <w:rPr>
-        <w:b/>
-        <w:i/>
-        <w:color w:val="000000"/>
-        <w:sz w:val="20"/>
-        <w:szCs w:val="20"/>
-      </w:rPr>
-      <w:t xml:space="preserve"> y </w:t>
-    </w:r>
-    <w:proofErr w:type="spellStart"/>
-    <w:r>
-      <w:rPr>
-        <w:b/>
-        <w:i/>
-        <w:color w:val="000000"/>
-        <w:sz w:val="20"/>
-        <w:szCs w:val="20"/>
-      </w:rPr>
-      <w:t>Seilevel</w:t>
-    </w:r>
-    <w:proofErr w:type="spellEnd"/>
-    <w:r>
-      <w:rPr>
-        <w:b/>
-        <w:i/>
-        <w:color w:val="000000"/>
-        <w:sz w:val="20"/>
-        <w:szCs w:val="20"/>
-      </w:rPr>
-      <w:t xml:space="preserve"> </w:t>
-    </w:r>
-    <w:proofErr w:type="spellStart"/>
-    <w:r>
-      <w:rPr>
-        <w:b/>
-        <w:i/>
-        <w:color w:val="000000"/>
-        <w:sz w:val="20"/>
-        <w:szCs w:val="20"/>
-      </w:rPr>
-      <w:t>Partners</w:t>
-    </w:r>
-    <w:proofErr w:type="spellEnd"/>
-    <w:r>
-      <w:rPr>
-        <w:b/>
-        <w:i/>
-        <w:color w:val="000000"/>
-        <w:sz w:val="20"/>
-        <w:szCs w:val="20"/>
-      </w:rPr>
-      <w:t xml:space="preserve"> LP. Se concede permiso para usar y modificar.</w:t>
+      <w:t>Derechos de autor © 2023 por Karl Wiegers y Seilevel Partners LP. Se concede permiso para usar y modificar.</w:t>
     </w:r>
   </w:p>
 </w:ftr>
@@ -39874,6 +39168,14 @@
     <w:abstractNumId w:val="33"/>
   </w:num>
 </w:numbering>
+</file>
+
+<file path=word/people.xml><?xml version="1.0" encoding="utf-8"?>
+<w15:people xmlns:wpc="http://schemas.microsoft.com/office/word/2010/wordprocessingCanvas" xmlns:cx="http://schemas.microsoft.com/office/drawing/2014/chartex" xmlns:cx1="http://schemas.microsoft.com/office/drawing/2015/9/8/chartex" xmlns:cx2="http://schemas.microsoft.com/office/drawing/2015/10/21/chartex" xmlns:cx3="http://schemas.microsoft.com/office/drawing/2016/5/9/chartex" xmlns:cx4="http://schemas.microsoft.com/office/drawing/2016/5/10/chartex" xmlns:cx5="http://schemas.microsoft.com/office/drawing/2016/5/11/chartex" xmlns:cx6="http://schemas.microsoft.com/office/drawing/2016/5/12/chartex" xmlns:cx7="http://schemas.microsoft.com/office/drawing/2016/5/13/chartex" xmlns:cx8="http://schemas.microsoft.com/office/drawing/2016/5/14/chartex" xmlns:mc="http://schemas.openxmlformats.org/markup-compatibility/2006" xmlns:aink="http://schemas.microsoft.com/office/drawing/2016/ink" xmlns:am3d="http://schemas.microsoft.com/office/drawing/2017/model3d" xmlns:o="urn:schemas-microsoft-com:office:office" xmlns:oel="http://schemas.microsoft.com/office/2019/extlst" xmlns:r="http://schemas.openxmlformats.org/officeDocument/2006/relationships" xmlns:m="http://schemas.openxmlformats.org/officeDocument/2006/math" xmlns:v="urn:schemas-microsoft-com:vml" xmlns:wp14="http://schemas.microsoft.com/office/word/2010/wordprocessingDrawing" xmlns:wp="http://schemas.openxmlformats.org/drawingml/2006/wordprocessingDrawing" xmlns:w10="urn:schemas-microsoft-com:office:word" xmlns:w="http://schemas.openxmlformats.org/wordprocessingml/2006/main" xmlns:w14="http://schemas.microsoft.com/office/word/2010/wordml" xmlns:w15="http://schemas.microsoft.com/office/word/2012/wordml" xmlns:w16cex="http://schemas.microsoft.com/office/word/2018/wordml/cex" xmlns:w16cid="http://schemas.microsoft.com/office/word/2016/wordml/cid" xmlns:w16="http://schemas.microsoft.com/office/word/2018/wordml" xmlns:w16du="http://schemas.microsoft.com/office/word/2023/wordml/word16du" xmlns:w16sdtdh="http://schemas.microsoft.com/office/word/2020/wordml/sdtdatahash" xmlns:w16sdtfl="http://schemas.microsoft.com/office/word/2024/wordml/sdtformatlock" xmlns:w16se="http://schemas.microsoft.com/office/word/2015/wordml/symex" xmlns:wpg="http://schemas.microsoft.com/office/word/2010/wordprocessingGroup" xmlns:wpi="http://schemas.microsoft.com/office/word/2010/wordprocessingInk" xmlns:wne="http://schemas.microsoft.com/office/word/2006/wordml" xmlns:wps="http://schemas.microsoft.com/office/word/2010/wordprocessingShape" mc:Ignorable="w14 w15 w16se w16cid w16 w16cex w16sdtdh w16sdtfl w16du wp14">
+  <w15:person w15:author="MELANIE OVIEDO MALEA�O">
+    <w15:presenceInfo w15:providerId="AD" w15:userId="S::melanie.oviedo.maleano@est.una.ac.cr::61f254db-192c-476d-b674-80a973537dcd"/>
+  </w15:person>
+</w15:people>
 </file>
 
 <file path=word/styles.xml><?xml version="1.0" encoding="utf-8"?>
@@ -40709,7 +40011,6 @@
     <w:basedOn w:val="Normal"/>
     <w:link w:val="TextocomentarioCar"/>
     <w:uiPriority w:val="99"/>
-    <w:semiHidden/>
     <w:unhideWhenUsed/>
     <w:rPr>
       <w:sz w:val="20"/>
@@ -40721,7 +40022,6 @@
     <w:basedOn w:val="Fuentedeprrafopredeter"/>
     <w:link w:val="Textocomentario"/>
     <w:uiPriority w:val="99"/>
-    <w:semiHidden/>
     <w:rPr>
       <w:sz w:val="20"/>
       <w:szCs w:val="20"/>
@@ -40941,6 +40241,41 @@
     <w:name w:val="citation-205"/>
     <w:basedOn w:val="Fuentedeprrafopredeter"/>
     <w:rsid w:val="004526BE"/>
+  </w:style>
+  <w:style w:type="paragraph" w:styleId="Asuntodelcomentario">
+    <w:name w:val="annotation subject"/>
+    <w:basedOn w:val="Textocomentario"/>
+    <w:next w:val="Textocomentario"/>
+    <w:link w:val="AsuntodelcomentarioCar"/>
+    <w:uiPriority w:val="99"/>
+    <w:semiHidden/>
+    <w:unhideWhenUsed/>
+    <w:rsid w:val="00752791"/>
+    <w:rPr>
+      <w:b/>
+      <w:bCs/>
+    </w:rPr>
+  </w:style>
+  <w:style w:type="character" w:customStyle="1" w:styleId="AsuntodelcomentarioCar">
+    <w:name w:val="Asunto del comentario Car"/>
+    <w:basedOn w:val="TextocomentarioCar"/>
+    <w:link w:val="Asuntodelcomentario"/>
+    <w:uiPriority w:val="99"/>
+    <w:semiHidden/>
+    <w:rsid w:val="00752791"/>
+    <w:rPr>
+      <w:b/>
+      <w:bCs/>
+      <w:sz w:val="20"/>
+      <w:szCs w:val="20"/>
+    </w:rPr>
+  </w:style>
+  <w:style w:type="paragraph" w:styleId="Revisin">
+    <w:name w:val="Revision"/>
+    <w:hidden/>
+    <w:uiPriority w:val="99"/>
+    <w:semiHidden/>
+    <w:rsid w:val="006144D6"/>
   </w:style>
 </w:styles>
 </file>

</xml_diff>

<commit_message>
Added and updated sequence diagrams for multiple use cases (CON, DASH, FIN, MP, PER, PROV, REP, SEG, VNF) in the uml/sequence_diagrams folder. Added use case diagram image. Updated documents: Use Case Document, Risk Matrix, and Use Case Prioritization. Deleted temporary files from sequence_diagrams and use_case_diagrams folders.
</commit_message>
<xml_diff>
--- a/docs/Documento de Casos de Uso.docx
+++ b/docs/Documento de Casos de Uso.docx
@@ -133,7 +133,20 @@
           <w:lang w:eastAsia="es-CR"/>
           <w14:ligatures w14:val="none"/>
         </w:rPr>
-        <w:t>Versión 2.0</w:t>
+        <w:t>Versión 2.</w:t>
+      </w:r>
+      <w:r>
+        <w:rPr>
+          <w:rFonts w:ascii="Times New Roman" w:eastAsia="Times New Roman" w:hAnsi="Times New Roman" w:cs="Times New Roman"/>
+          <w:b/>
+          <w:color w:val="000000"/>
+          <w:kern w:val="0"/>
+          <w:sz w:val="32"/>
+          <w:szCs w:val="32"/>
+          <w:lang w:eastAsia="es-CR"/>
+          <w14:ligatures w14:val="none"/>
+        </w:rPr>
+        <w:t>1</w:t>
       </w:r>
     </w:p>
     <w:p>
@@ -1462,9 +1475,6 @@
         <w:tc>
           <w:tcPr>
             <w:tcW w:w="2160" w:type="dxa"/>
-            <w:tcBorders>
-              <w:bottom w:val="single" w:sz="12" w:space="0" w:color="000000"/>
-            </w:tcBorders>
           </w:tcPr>
           <w:p>
             <w:pPr>
@@ -1499,9 +1509,6 @@
         <w:tc>
           <w:tcPr>
             <w:tcW w:w="1170" w:type="dxa"/>
-            <w:tcBorders>
-              <w:bottom w:val="single" w:sz="12" w:space="0" w:color="000000"/>
-            </w:tcBorders>
           </w:tcPr>
           <w:p>
             <w:pPr>
@@ -1536,9 +1543,6 @@
         <w:tc>
           <w:tcPr>
             <w:tcW w:w="5019" w:type="dxa"/>
-            <w:tcBorders>
-              <w:bottom w:val="single" w:sz="12" w:space="0" w:color="000000"/>
-            </w:tcBorders>
           </w:tcPr>
           <w:p>
             <w:pPr>
@@ -1573,9 +1577,6 @@
         <w:tc>
           <w:tcPr>
             <w:tcW w:w="1519" w:type="dxa"/>
-            <w:tcBorders>
-              <w:bottom w:val="single" w:sz="12" w:space="0" w:color="000000"/>
-            </w:tcBorders>
           </w:tcPr>
           <w:p>
             <w:pPr>
@@ -1604,6 +1605,156 @@
                 <w14:ligatures w14:val="none"/>
               </w:rPr>
               <w:t>2.0</w:t>
+            </w:r>
+          </w:p>
+        </w:tc>
+      </w:tr>
+      <w:tr>
+        <w:tc>
+          <w:tcPr>
+            <w:tcW w:w="2160" w:type="dxa"/>
+            <w:tcBorders>
+              <w:bottom w:val="single" w:sz="12" w:space="0" w:color="000000"/>
+            </w:tcBorders>
+          </w:tcPr>
+          <w:p>
+            <w:pPr>
+              <w:pBdr>
+                <w:top w:val="nil"/>
+                <w:left w:val="nil"/>
+                <w:bottom w:val="nil"/>
+                <w:right w:val="nil"/>
+                <w:between w:val="nil"/>
+              </w:pBdr>
+              <w:spacing w:before="40" w:after="40" w:line="360" w:lineRule="auto"/>
+              <w:rPr>
+                <w:rFonts w:ascii="Times New Roman" w:eastAsia="Times New Roman" w:hAnsi="Times New Roman" w:cs="Times New Roman"/>
+                <w:bCs/>
+                <w:kern w:val="0"/>
+                <w:lang w:eastAsia="es-CR"/>
+                <w14:ligatures w14:val="none"/>
+              </w:rPr>
+            </w:pPr>
+            <w:r>
+              <w:rPr>
+                <w:rFonts w:ascii="Times New Roman" w:eastAsia="Times New Roman" w:hAnsi="Times New Roman" w:cs="Times New Roman"/>
+                <w:bCs/>
+                <w:kern w:val="0"/>
+                <w:lang w:eastAsia="es-CR"/>
+                <w14:ligatures w14:val="none"/>
+              </w:rPr>
+              <w:t>Team Developer</w:t>
+            </w:r>
+          </w:p>
+        </w:tc>
+        <w:tc>
+          <w:tcPr>
+            <w:tcW w:w="1170" w:type="dxa"/>
+            <w:tcBorders>
+              <w:bottom w:val="single" w:sz="12" w:space="0" w:color="000000"/>
+            </w:tcBorders>
+          </w:tcPr>
+          <w:p>
+            <w:pPr>
+              <w:pBdr>
+                <w:top w:val="nil"/>
+                <w:left w:val="nil"/>
+                <w:bottom w:val="nil"/>
+                <w:right w:val="nil"/>
+                <w:between w:val="nil"/>
+              </w:pBdr>
+              <w:spacing w:before="40" w:after="40" w:line="360" w:lineRule="auto"/>
+              <w:rPr>
+                <w:rFonts w:ascii="Times New Roman" w:eastAsia="Times New Roman" w:hAnsi="Times New Roman" w:cs="Times New Roman"/>
+                <w:bCs/>
+                <w:kern w:val="0"/>
+                <w:lang w:eastAsia="es-CR"/>
+                <w14:ligatures w14:val="none"/>
+              </w:rPr>
+            </w:pPr>
+            <w:r>
+              <w:rPr>
+                <w:rFonts w:ascii="Times New Roman" w:eastAsia="Times New Roman" w:hAnsi="Times New Roman" w:cs="Times New Roman"/>
+                <w:bCs/>
+                <w:kern w:val="0"/>
+                <w:lang w:eastAsia="es-CR"/>
+                <w14:ligatures w14:val="none"/>
+              </w:rPr>
+              <w:t>09/09/25</w:t>
+            </w:r>
+          </w:p>
+        </w:tc>
+        <w:tc>
+          <w:tcPr>
+            <w:tcW w:w="5019" w:type="dxa"/>
+            <w:tcBorders>
+              <w:bottom w:val="single" w:sz="12" w:space="0" w:color="000000"/>
+            </w:tcBorders>
+          </w:tcPr>
+          <w:p>
+            <w:pPr>
+              <w:pBdr>
+                <w:top w:val="nil"/>
+                <w:left w:val="nil"/>
+                <w:bottom w:val="nil"/>
+                <w:right w:val="nil"/>
+                <w:between w:val="nil"/>
+              </w:pBdr>
+              <w:spacing w:before="40" w:after="40" w:line="360" w:lineRule="auto"/>
+              <w:rPr>
+                <w:rFonts w:ascii="Times New Roman" w:eastAsia="Times New Roman" w:hAnsi="Times New Roman" w:cs="Times New Roman"/>
+                <w:bCs/>
+                <w:kern w:val="0"/>
+                <w:lang w:eastAsia="es-CR"/>
+                <w14:ligatures w14:val="none"/>
+              </w:rPr>
+            </w:pPr>
+            <w:r>
+              <w:rPr>
+                <w:rFonts w:ascii="Times New Roman" w:eastAsia="Times New Roman" w:hAnsi="Times New Roman" w:cs="Times New Roman"/>
+                <w:bCs/>
+                <w:kern w:val="0"/>
+                <w:lang w:eastAsia="es-CR"/>
+                <w14:ligatures w14:val="none"/>
+              </w:rPr>
+              <w:t>Añadido Diagrama de Casos de Uso actualizado.</w:t>
+            </w:r>
+          </w:p>
+        </w:tc>
+        <w:tc>
+          <w:tcPr>
+            <w:tcW w:w="1519" w:type="dxa"/>
+            <w:tcBorders>
+              <w:bottom w:val="single" w:sz="12" w:space="0" w:color="000000"/>
+            </w:tcBorders>
+          </w:tcPr>
+          <w:p>
+            <w:pPr>
+              <w:pBdr>
+                <w:top w:val="nil"/>
+                <w:left w:val="nil"/>
+                <w:bottom w:val="nil"/>
+                <w:right w:val="nil"/>
+                <w:between w:val="nil"/>
+              </w:pBdr>
+              <w:spacing w:before="40" w:after="40" w:line="360" w:lineRule="auto"/>
+              <w:rPr>
+                <w:rFonts w:ascii="Times New Roman" w:eastAsia="Times New Roman" w:hAnsi="Times New Roman" w:cs="Times New Roman"/>
+                <w:bCs/>
+                <w:kern w:val="0"/>
+                <w:lang w:eastAsia="es-CR"/>
+                <w14:ligatures w14:val="none"/>
+              </w:rPr>
+            </w:pPr>
+            <w:r>
+              <w:rPr>
+                <w:rFonts w:ascii="Times New Roman" w:eastAsia="Times New Roman" w:hAnsi="Times New Roman" w:cs="Times New Roman"/>
+                <w:bCs/>
+                <w:kern w:val="0"/>
+                <w:lang w:eastAsia="es-CR"/>
+                <w14:ligatures w14:val="none"/>
+              </w:rPr>
+              <w:t>2.1</w:t>
             </w:r>
           </w:p>
         </w:tc>
@@ -1853,20 +2004,7 @@
                 <w:lang w:eastAsia="es-CR"/>
                 <w14:ligatures w14:val="none"/>
               </w:rPr>
-              <w:t>CU-DASH-001</w:t>
-            </w:r>
-            <w:r>
-              <w:rPr>
-                <w:rFonts w:ascii="Arial" w:eastAsia="Arial" w:hAnsi="Arial" w:cs="Arial"/>
-                <w:b/>
-                <w:bCs/>
-                <w:kern w:val="0"/>
-                <w:sz w:val="22"/>
-                <w:szCs w:val="22"/>
-                <w:lang w:eastAsia="es-CR"/>
-                <w14:ligatures w14:val="none"/>
-              </w:rPr>
-              <w:t xml:space="preserve">: </w:t>
+              <w:t xml:space="preserve">CU-DASH-001: </w:t>
             </w:r>
             <w:r>
               <w:rPr>
@@ -4517,6 +4655,7 @@
                 <w:lang w:eastAsia="es-CR"/>
                 <w14:ligatures w14:val="none"/>
               </w:rPr>
+              <w:lastRenderedPageBreak/>
               <w:t xml:space="preserve">Corrupción de Datos: </w:t>
             </w:r>
             <w:r>
@@ -4585,6 +4724,7 @@
                 <w:lang w:eastAsia="es-CR"/>
                 <w14:ligatures w14:val="none"/>
               </w:rPr>
+              <w:lastRenderedPageBreak/>
               <w:t>Prioridad:</w:t>
             </w:r>
           </w:p>
@@ -6173,6 +6313,7 @@
                 <w:lang w:eastAsia="es-CR"/>
                 <w14:ligatures w14:val="none"/>
               </w:rPr>
+              <w:lastRenderedPageBreak/>
               <w:t>Filtrar empleados:</w:t>
             </w:r>
             <w:r>
@@ -6230,6 +6371,7 @@
                 <w:lang w:eastAsia="es-CR"/>
                 <w14:ligatures w14:val="none"/>
               </w:rPr>
+              <w:lastRenderedPageBreak/>
               <w:t>Flujos alternativos:</w:t>
             </w:r>
           </w:p>
@@ -8012,6 +8154,7 @@
                 <w:lang w:eastAsia="es-CR"/>
                 <w14:ligatures w14:val="none"/>
               </w:rPr>
+              <w:lastRenderedPageBreak/>
               <w:t>Flujo normal:</w:t>
             </w:r>
           </w:p>
@@ -9920,6 +10063,7 @@
                 <w:lang w:eastAsia="es-CR"/>
                 <w14:ligatures w14:val="none"/>
               </w:rPr>
+              <w:lastRenderedPageBreak/>
               <w:t>Flujo normal:</w:t>
             </w:r>
           </w:p>
@@ -11345,6 +11489,7 @@
                 <w:lang w:eastAsia="es-CR"/>
                 <w14:ligatures w14:val="none"/>
               </w:rPr>
+              <w:lastRenderedPageBreak/>
               <w:t xml:space="preserve">RNF-US-001: </w:t>
             </w:r>
             <w:r>
@@ -11453,6 +11598,7 @@
           <w:lang w:eastAsia="es-CR"/>
           <w14:ligatures w14:val="none"/>
         </w:rPr>
+        <w:lastRenderedPageBreak/>
         <w:t>Módulo de</w:t>
       </w:r>
       <w:r>
@@ -13186,6 +13332,7 @@
                 <w:lang w:eastAsia="es-CR"/>
                 <w14:ligatures w14:val="none"/>
               </w:rPr>
+              <w:lastRenderedPageBreak/>
               <w:t xml:space="preserve">RNF-US-001: </w:t>
             </w:r>
             <w:r>
@@ -14769,6 +14916,7 @@
                 <w:lang w:eastAsia="es-CR"/>
                 <w14:ligatures w14:val="none"/>
               </w:rPr>
+              <w:lastRenderedPageBreak/>
               <w:t>Requerimientos relacionados:</w:t>
             </w:r>
           </w:p>
@@ -16764,6 +16912,7 @@
           <w:lang w:eastAsia="es-CR"/>
           <w14:ligatures w14:val="none"/>
         </w:rPr>
+        <w:lastRenderedPageBreak/>
         <w:t>Módulo de Menú y Productos</w:t>
       </w:r>
     </w:p>
@@ -18426,6 +18575,7 @@
                 <w:lang w:eastAsia="es-CR"/>
                 <w14:ligatures w14:val="none"/>
               </w:rPr>
+              <w:lastRenderedPageBreak/>
               <w:t>Reglas del negocio:</w:t>
             </w:r>
           </w:p>
@@ -20172,6 +20322,7 @@
                 <w:lang w:eastAsia="es-CR"/>
                 <w14:ligatures w14:val="none"/>
               </w:rPr>
+              <w:lastRenderedPageBreak/>
               <w:t>Flujos alternativos:</w:t>
             </w:r>
           </w:p>
@@ -22101,6 +22252,7 @@
                 <w:lang w:eastAsia="es-CR"/>
                 <w14:ligatures w14:val="none"/>
               </w:rPr>
+              <w:lastRenderedPageBreak/>
               <w:t>Flujos alternativos:</w:t>
             </w:r>
           </w:p>
@@ -23996,6 +24148,7 @@
                 <w:lang w:eastAsia="es-CR"/>
                 <w14:ligatures w14:val="none"/>
               </w:rPr>
+              <w:lastRenderedPageBreak/>
               <w:t>El sistema muestra un mensaje de éxito.</w:t>
             </w:r>
           </w:p>
@@ -24042,6 +24195,7 @@
                 <w:lang w:eastAsia="es-CR"/>
                 <w14:ligatures w14:val="none"/>
               </w:rPr>
+              <w:lastRenderedPageBreak/>
               <w:t>Flujos alternativos:</w:t>
             </w:r>
           </w:p>
@@ -25875,6 +26029,7 @@
                 <w:lang w:eastAsia="es-CR"/>
                 <w14:ligatures w14:val="none"/>
               </w:rPr>
+              <w:lastRenderedPageBreak/>
               <w:t>Flujos alternativos:</w:t>
             </w:r>
           </w:p>
@@ -27667,6 +27822,7 @@
                 <w:lang w:eastAsia="es-CR"/>
                 <w14:ligatures w14:val="none"/>
               </w:rPr>
+              <w:lastRenderedPageBreak/>
               <w:t>Prioridad:</w:t>
             </w:r>
           </w:p>
@@ -29949,6 +30105,7 @@
                 <w:lang w:eastAsia="es-CR"/>
                 <w14:ligatures w14:val="none"/>
               </w:rPr>
+              <w:lastRenderedPageBreak/>
               <w:t>ID de caso de uso:</w:t>
             </w:r>
           </w:p>
@@ -31873,7 +32030,19 @@
                 <w:lang w:eastAsia="es-CR"/>
                 <w14:ligatures w14:val="none"/>
               </w:rPr>
-              <w:t>l Administrador puede registrar nuevos proveedores en el sistema. Al registrar un proveedor, se debe capturar su información de contacto y asociar productos específicos que este proveedor suministra, lo que facilita la gestión de compras y abastecimiento.</w:t>
+              <w:t xml:space="preserve">l Administrador puede registrar nuevos proveedores en el sistema. Al registrar un proveedor, se debe capturar su información de contacto y </w:t>
+            </w:r>
+            <w:r>
+              <w:rPr>
+                <w:rFonts w:ascii="Arial" w:eastAsia="Arial" w:hAnsi="Arial" w:cs="Arial"/>
+                <w:kern w:val="0"/>
+                <w:sz w:val="22"/>
+                <w:szCs w:val="22"/>
+                <w:lang w:eastAsia="es-CR"/>
+                <w14:ligatures w14:val="none"/>
+              </w:rPr>
+              <w:lastRenderedPageBreak/>
+              <w:t>asociar productos específicos que este proveedor suministra, lo que facilita la gestión de compras y abastecimiento.</w:t>
             </w:r>
           </w:p>
         </w:tc>
@@ -31919,6 +32088,7 @@
                 <w:lang w:eastAsia="es-CR"/>
                 <w14:ligatures w14:val="none"/>
               </w:rPr>
+              <w:lastRenderedPageBreak/>
               <w:t>Condiciones previas:</w:t>
             </w:r>
           </w:p>
@@ -33716,6 +33886,7 @@
                 <w:lang w:eastAsia="es-CR"/>
                 <w14:ligatures w14:val="none"/>
               </w:rPr>
+              <w:lastRenderedPageBreak/>
               <w:t>Postcondiciones:</w:t>
             </w:r>
           </w:p>
@@ -35593,6 +35764,7 @@
                 <w:lang w:eastAsia="es-CR"/>
                 <w14:ligatures w14:val="none"/>
               </w:rPr>
+              <w:lastRenderedPageBreak/>
               <w:t>El Administrador especifica los criterios de personalización (por ejemplo, el rango de fechas).</w:t>
             </w:r>
           </w:p>
@@ -35729,6 +35901,7 @@
                 <w:lang w:eastAsia="es-CR"/>
                 <w14:ligatures w14:val="none"/>
               </w:rPr>
+              <w:lastRenderedPageBreak/>
               <w:t>Flujos alternativos:</w:t>
             </w:r>
           </w:p>
@@ -37381,6 +37554,7 @@
                 <w:lang w:eastAsia="es-CR"/>
                 <w14:ligatures w14:val="none"/>
               </w:rPr>
+              <w:lastRenderedPageBreak/>
               <w:t>El sistema genera el reporte y lo muestra en pantalla.</w:t>
             </w:r>
           </w:p>
@@ -37427,6 +37601,7 @@
                 <w:lang w:eastAsia="es-CR"/>
                 <w14:ligatures w14:val="none"/>
               </w:rPr>
+              <w:lastRenderedPageBreak/>
               <w:t>Flujos alternativos:</w:t>
             </w:r>
           </w:p>
@@ -39311,6 +39486,7 @@
                 <w:lang w:eastAsia="es-CR"/>
                 <w14:ligatures w14:val="none"/>
               </w:rPr>
+              <w:lastRenderedPageBreak/>
               <w:t>Reglas del negocio:</w:t>
             </w:r>
           </w:p>
@@ -40058,7 +40234,6 @@
                 <w:lang w:eastAsia="es-CR"/>
                 <w14:ligatures w14:val="none"/>
               </w:rPr>
-              <w:lastRenderedPageBreak/>
               <w:t>Condiciones previas:</w:t>
             </w:r>
           </w:p>
@@ -41207,17 +41382,13 @@
       </w:pPr>
       <w:r>
         <w:rPr>
-          <w:rFonts w:ascii="Times New Roman" w:eastAsia="Times New Roman" w:hAnsi="Times New Roman" w:cs="Times New Roman"/>
           <w:noProof/>
-          <w:kern w:val="0"/>
-          <w:lang w:eastAsia="es-CR"/>
-          <w14:ligatures w14:val="none"/>
         </w:rPr>
         <w:drawing>
-          <wp:inline distT="0" distB="0" distL="0" distR="0" wp14:anchorId="32181234" wp14:editId="06CD7911">
-            <wp:extent cx="6126480" cy="3862705"/>
-            <wp:effectExtent l="0" t="0" r="7620" b="4445"/>
-            <wp:docPr id="541435940" name="Imagen 1" descr="Diagrama&#10;&#10;El contenido generado por IA puede ser incorrecto."/>
+          <wp:inline distT="0" distB="0" distL="0" distR="0" wp14:anchorId="73656ED6" wp14:editId="67EBBCC1">
+            <wp:extent cx="6126480" cy="7332980"/>
+            <wp:effectExtent l="0" t="0" r="7620" b="1270"/>
+            <wp:docPr id="1184862241" name="Imagen 1"/>
             <wp:cNvGraphicFramePr>
               <a:graphicFrameLocks xmlns:a="http://schemas.openxmlformats.org/drawingml/2006/main" noChangeAspect="1"/>
             </wp:cNvGraphicFramePr>
@@ -41225,23 +41396,36 @@
               <a:graphicData uri="http://schemas.openxmlformats.org/drawingml/2006/picture">
                 <pic:pic xmlns:pic="http://schemas.openxmlformats.org/drawingml/2006/picture">
                   <pic:nvPicPr>
-                    <pic:cNvPr id="541435940" name="Imagen 1" descr="Diagrama&#10;&#10;El contenido generado por IA puede ser incorrecto."/>
-                    <pic:cNvPicPr/>
+                    <pic:cNvPr id="0" name="Picture 1"/>
+                    <pic:cNvPicPr>
+                      <a:picLocks noChangeAspect="1" noChangeArrowheads="1"/>
+                    </pic:cNvPicPr>
                   </pic:nvPicPr>
                   <pic:blipFill>
-                    <a:blip r:embed="rId10"/>
+                    <a:blip r:embed="rId10" cstate="print">
+                      <a:extLst>
+                        <a:ext uri="{28A0092B-C50C-407E-A947-70E740481C1C}">
+                          <a14:useLocalDpi xmlns:a14="http://schemas.microsoft.com/office/drawing/2010/main" val="0"/>
+                        </a:ext>
+                      </a:extLst>
+                    </a:blip>
+                    <a:srcRect/>
                     <a:stretch>
                       <a:fillRect/>
                     </a:stretch>
                   </pic:blipFill>
-                  <pic:spPr>
+                  <pic:spPr bwMode="auto">
                     <a:xfrm>
                       <a:off x="0" y="0"/>
-                      <a:ext cx="6126480" cy="3862705"/>
+                      <a:ext cx="6126480" cy="7332980"/>
                     </a:xfrm>
                     <a:prstGeom prst="rect">
                       <a:avLst/>
                     </a:prstGeom>
+                    <a:noFill/>
+                    <a:ln>
+                      <a:noFill/>
+                    </a:ln>
                   </pic:spPr>
                 </pic:pic>
               </a:graphicData>

</xml_diff>